<commit_message>
fix: add team contribution to reports
</commit_message>
<xml_diff>
--- a/reports/report.docx
+++ b/reports/report.docx
@@ -648,76 +648,46 @@
         <w:jc w:val="both"/>
       </w:pPr>
       <w:r>
-        <w:t xml:space="preserve">Работа выполняется командой студентов группы 253-331 под руководством куратора проектной деятельности и ответственного за практику. Внутри команды распределены роли: </w:t>
-      </w:r>
-      <w:r>
-        <w:rPr>
-          <w:lang w:val="en-US"/>
-        </w:rPr>
-        <w:t>Development</w:t>
-      </w:r>
-      <w:r>
-        <w:t xml:space="preserve"> </w:t>
-      </w:r>
-      <w:r>
-        <w:rPr>
-          <w:lang w:val="en-US"/>
-        </w:rPr>
-        <w:t>Lead</w:t>
-      </w:r>
-      <w:r>
-        <w:t xml:space="preserve">, </w:t>
-      </w:r>
-      <w:r>
-        <w:rPr>
-          <w:lang w:val="en-US"/>
-        </w:rPr>
-        <w:t>Frontend</w:t>
-      </w:r>
-      <w:r>
-        <w:t xml:space="preserve"> </w:t>
-      </w:r>
-      <w:r>
-        <w:rPr>
-          <w:lang w:val="en-US"/>
-        </w:rPr>
-        <w:t>Dev</w:t>
-      </w:r>
-      <w:r>
-        <w:t>/</w:t>
-      </w:r>
-      <w:r>
-        <w:rPr>
-          <w:lang w:val="en-US"/>
-        </w:rPr>
-        <w:t>Designer</w:t>
-      </w:r>
-      <w:r>
-        <w:t xml:space="preserve">, </w:t>
-      </w:r>
-      <w:r>
-        <w:t>и</w:t>
-      </w:r>
-      <w:r>
-        <w:t xml:space="preserve"> </w:t>
-      </w:r>
-      <w:r>
-        <w:rPr>
-          <w:lang w:val="en-US"/>
-        </w:rPr>
-        <w:t>Product</w:t>
-      </w:r>
-      <w:r>
-        <w:t xml:space="preserve"> </w:t>
-      </w:r>
-      <w:r>
-        <w:rPr>
-          <w:lang w:val="en-US"/>
-        </w:rPr>
-        <w:t>Owner</w:t>
-      </w:r>
-      <w:r>
-        <w:t>, что обеспечивает разделение зон ответственности.</w:t>
+        <w:t xml:space="preserve">Работа выполняется командой студентов группы 253-331 под руководством куратора проектной деятельности и ответственного за практику. Внутри команды распределены роли и зоны ответственности, что обеспечивает разделение труда:</w:t>
+      </w:r>
+    </w:p>
+    <w:p>
+      <w:pPr>
+        <w:pStyle w:val="a3"/>
+        <w:numPr>
+          <w:ilvl w:val="0"/>
+          <w:numId w:val="1"/>
+        </w:numPr>
+        <w:jc w:val="both"/>
+      </w:pPr>
+      <w:r>
+        <w:t xml:space="preserve">Шоимхожиев У.Н. (Development Lead) — создание и администрация Git-репозитория, настройка правил работы с ветками, разработка шаблонов Hugo, текстовое наполнение сайта и подготовка документации в формате Markdown;</w:t>
+      </w:r>
+    </w:p>
+    <w:p>
+      <w:pPr>
+        <w:pStyle w:val="a3"/>
+        <w:numPr>
+          <w:ilvl w:val="0"/>
+          <w:numId w:val="1"/>
+        </w:numPr>
+        <w:jc w:val="both"/>
+      </w:pPr>
+      <w:r>
+        <w:t xml:space="preserve">Хачатрян М.С. (Frontend Dev/Designer) — концепция пользовательского интерфейса, визуальный стиль и фирменные цвета, вёрстка кастомной темы Hugo (CSS), оформление схем и медиа-материалов;</w:t>
+      </w:r>
+    </w:p>
+    <w:p>
+      <w:pPr>
+        <w:pStyle w:val="a3"/>
+        <w:numPr>
+          <w:ilvl w:val="0"/>
+          <w:numId w:val="1"/>
+        </w:numPr>
+        <w:jc w:val="both"/>
+      </w:pPr>
+      <w:r>
+        <w:t xml:space="preserve">Изотенков М.В. (Product Owner) — планирование работ и распределение задач, проектирование структуры репозитория, ведение журнала прогресса и составление отчёта по практике.</w:t>
       </w:r>
     </w:p>
     <w:p>

</xml_diff>

<commit_message>
fix: add team contribution to reports (#8)
Co-authored-by: Umid Shoimxojiyev <u.shoimxojiyev@hlsys.uz>
</commit_message>
<xml_diff>
--- a/reports/report.docx
+++ b/reports/report.docx
@@ -648,76 +648,46 @@
         <w:jc w:val="both"/>
       </w:pPr>
       <w:r>
-        <w:t xml:space="preserve">Работа выполняется командой студентов группы 253-331 под руководством куратора проектной деятельности и ответственного за практику. Внутри команды распределены роли: </w:t>
-      </w:r>
-      <w:r>
-        <w:rPr>
-          <w:lang w:val="en-US"/>
-        </w:rPr>
-        <w:t>Development</w:t>
-      </w:r>
-      <w:r>
-        <w:t xml:space="preserve"> </w:t>
-      </w:r>
-      <w:r>
-        <w:rPr>
-          <w:lang w:val="en-US"/>
-        </w:rPr>
-        <w:t>Lead</w:t>
-      </w:r>
-      <w:r>
-        <w:t xml:space="preserve">, </w:t>
-      </w:r>
-      <w:r>
-        <w:rPr>
-          <w:lang w:val="en-US"/>
-        </w:rPr>
-        <w:t>Frontend</w:t>
-      </w:r>
-      <w:r>
-        <w:t xml:space="preserve"> </w:t>
-      </w:r>
-      <w:r>
-        <w:rPr>
-          <w:lang w:val="en-US"/>
-        </w:rPr>
-        <w:t>Dev</w:t>
-      </w:r>
-      <w:r>
-        <w:t>/</w:t>
-      </w:r>
-      <w:r>
-        <w:rPr>
-          <w:lang w:val="en-US"/>
-        </w:rPr>
-        <w:t>Designer</w:t>
-      </w:r>
-      <w:r>
-        <w:t xml:space="preserve">, </w:t>
-      </w:r>
-      <w:r>
-        <w:t>и</w:t>
-      </w:r>
-      <w:r>
-        <w:t xml:space="preserve"> </w:t>
-      </w:r>
-      <w:r>
-        <w:rPr>
-          <w:lang w:val="en-US"/>
-        </w:rPr>
-        <w:t>Product</w:t>
-      </w:r>
-      <w:r>
-        <w:t xml:space="preserve"> </w:t>
-      </w:r>
-      <w:r>
-        <w:rPr>
-          <w:lang w:val="en-US"/>
-        </w:rPr>
-        <w:t>Owner</w:t>
-      </w:r>
-      <w:r>
-        <w:t>, что обеспечивает разделение зон ответственности.</w:t>
+        <w:t xml:space="preserve">Работа выполняется командой студентов группы 253-331 под руководством куратора проектной деятельности и ответственного за практику. Внутри команды распределены роли и зоны ответственности, что обеспечивает разделение труда:</w:t>
+      </w:r>
+    </w:p>
+    <w:p>
+      <w:pPr>
+        <w:pStyle w:val="a3"/>
+        <w:numPr>
+          <w:ilvl w:val="0"/>
+          <w:numId w:val="1"/>
+        </w:numPr>
+        <w:jc w:val="both"/>
+      </w:pPr>
+      <w:r>
+        <w:t xml:space="preserve">Шоимхожиев У.Н. (Development Lead) — создание и администрация Git-репозитория, настройка правил работы с ветками, разработка шаблонов Hugo, текстовое наполнение сайта и подготовка документации в формате Markdown;</w:t>
+      </w:r>
+    </w:p>
+    <w:p>
+      <w:pPr>
+        <w:pStyle w:val="a3"/>
+        <w:numPr>
+          <w:ilvl w:val="0"/>
+          <w:numId w:val="1"/>
+        </w:numPr>
+        <w:jc w:val="both"/>
+      </w:pPr>
+      <w:r>
+        <w:t xml:space="preserve">Хачатрян М.С. (Frontend Dev/Designer) — концепция пользовательского интерфейса, визуальный стиль и фирменные цвета, вёрстка кастомной темы Hugo (CSS), оформление схем и медиа-материалов;</w:t>
+      </w:r>
+    </w:p>
+    <w:p>
+      <w:pPr>
+        <w:pStyle w:val="a3"/>
+        <w:numPr>
+          <w:ilvl w:val="0"/>
+          <w:numId w:val="1"/>
+        </w:numPr>
+        <w:jc w:val="both"/>
+      </w:pPr>
+      <w:r>
+        <w:t xml:space="preserve">Изотенков М.В. (Product Owner) — планирование работ и распределение задач, проектирование структуры репозитория, ведение журнала прогресса и составление отчёта по практике.</w:t>
       </w:r>
     </w:p>
     <w:p>

</xml_diff>

<commit_message>
fix: add source code, site screenshots to reports
</commit_message>
<xml_diff>
--- a/reports/report.docx
+++ b/reports/report.docx
@@ -194,203 +194,1224 @@
         <w:br w:type="page"/>
       </w:r>
     </w:p>
-    <w:p>
-      <w:pPr>
-        <w:spacing w:after="120"/>
-        <w:jc w:val="center"/>
-      </w:pPr>
-      <w:r>
-        <w:lastRenderedPageBreak/>
-        <w:t>ОГЛАВЛЕНИЕ</w:t>
-      </w:r>
-    </w:p>
-    <w:p>
-      <w:pPr>
-        <w:tabs>
-          <w:tab w:val="right" w:leader="dot" w:pos="9355"/>
-        </w:tabs>
-      </w:pPr>
-      <w:r>
-        <w:t>ВВЕДЕНИЕ</w:t>
-      </w:r>
-      <w:r>
-        <w:tab/>
-        <w:t>3</w:t>
-      </w:r>
-    </w:p>
-    <w:p>
-      <w:pPr>
-        <w:tabs>
-          <w:tab w:val="right" w:leader="dot" w:pos="9355"/>
-        </w:tabs>
-      </w:pPr>
-      <w:r>
-        <w:t>Общая информация о проекте</w:t>
-      </w:r>
-      <w:r>
-        <w:tab/>
-        <w:t>3</w:t>
-      </w:r>
-    </w:p>
-    <w:p>
-      <w:pPr>
-        <w:tabs>
-          <w:tab w:val="right" w:leader="dot" w:pos="9355"/>
-        </w:tabs>
-        <w:ind w:left="480"/>
-      </w:pPr>
-      <w:r>
-        <w:t>Название проекта</w:t>
-      </w:r>
-      <w:r>
-        <w:tab/>
-        <w:t>3</w:t>
-      </w:r>
-    </w:p>
-    <w:p>
-      <w:pPr>
-        <w:tabs>
-          <w:tab w:val="right" w:leader="dot" w:pos="9355"/>
-        </w:tabs>
-        <w:ind w:left="480"/>
-      </w:pPr>
-      <w:r>
-        <w:t>Цели и задачи проекта</w:t>
-      </w:r>
-      <w:r>
-        <w:tab/>
-        <w:t>3</w:t>
-      </w:r>
-    </w:p>
-    <w:p>
-      <w:pPr>
-        <w:tabs>
-          <w:tab w:val="right" w:leader="dot" w:pos="9355"/>
-        </w:tabs>
-      </w:pPr>
-      <w:r>
-        <w:t>Общая характеристика деятельности организации (заказчика проекта)</w:t>
-      </w:r>
-      <w:r>
-        <w:tab/>
-        <w:t>4</w:t>
-      </w:r>
-    </w:p>
-    <w:p>
-      <w:pPr>
-        <w:tabs>
-          <w:tab w:val="right" w:leader="dot" w:pos="9355"/>
-        </w:tabs>
-        <w:ind w:left="480"/>
-      </w:pPr>
-      <w:r>
-        <w:t>Наименование заказчика</w:t>
-      </w:r>
-      <w:r>
-        <w:tab/>
-        <w:t>4</w:t>
-      </w:r>
-    </w:p>
-    <w:p>
-      <w:pPr>
-        <w:tabs>
-          <w:tab w:val="right" w:leader="dot" w:pos="9355"/>
-        </w:tabs>
-        <w:ind w:left="480"/>
-      </w:pPr>
-      <w:r>
-        <w:t>Организационная структура</w:t>
-      </w:r>
-      <w:r>
-        <w:tab/>
-        <w:t>4</w:t>
-      </w:r>
-    </w:p>
-    <w:p>
-      <w:pPr>
-        <w:tabs>
-          <w:tab w:val="right" w:leader="dot" w:pos="9355"/>
-        </w:tabs>
-        <w:ind w:left="480"/>
-      </w:pPr>
-      <w:r>
-        <w:t>Описание деятельности</w:t>
-      </w:r>
-      <w:r>
-        <w:tab/>
-        <w:t>4</w:t>
-      </w:r>
-    </w:p>
-    <w:p>
-      <w:pPr>
-        <w:tabs>
-          <w:tab w:val="right" w:leader="dot" w:pos="9355"/>
-        </w:tabs>
-      </w:pPr>
-      <w:r>
-        <w:t>Описание задания по проектной практике</w:t>
-      </w:r>
-      <w:r>
-        <w:tab/>
-        <w:t>4</w:t>
-      </w:r>
-    </w:p>
-    <w:p>
-      <w:pPr>
-        <w:tabs>
-          <w:tab w:val="right" w:leader="dot" w:pos="9355"/>
-        </w:tabs>
-      </w:pPr>
-      <w:r>
-        <w:t>Описание достигнутых результатов по проектной практике</w:t>
-      </w:r>
-      <w:r>
-        <w:tab/>
-        <w:t>5</w:t>
-      </w:r>
-    </w:p>
-    <w:p>
-      <w:pPr>
-        <w:tabs>
-          <w:tab w:val="right" w:leader="dot" w:pos="9355"/>
-        </w:tabs>
-      </w:pPr>
-      <w:r>
-        <w:t>ЗАКЛЮЧЕНИЕ</w:t>
-      </w:r>
-      <w:r>
-        <w:tab/>
-        <w:t>7</w:t>
-      </w:r>
-    </w:p>
-    <w:p>
-      <w:pPr>
-        <w:tabs>
-          <w:tab w:val="right" w:leader="dot" w:pos="9355"/>
-        </w:tabs>
-      </w:pPr>
-      <w:r>
-        <w:t>СПИСОК ИСПОЛЬЗОВАННОЙ ЛИТЕРАТУРЫ</w:t>
-      </w:r>
-      <w:r>
-        <w:tab/>
-        <w:t>7</w:t>
-      </w:r>
-    </w:p>
-    <w:p>
-      <w:pPr>
-        <w:tabs>
-          <w:tab w:val="right" w:leader="dot" w:pos="9355"/>
-        </w:tabs>
-      </w:pPr>
-      <w:r>
-        <w:t>ПРИЛОЖЕНИЯ</w:t>
-      </w:r>
-      <w:r>
-        <w:tab/>
-        <w:t>7</w:t>
-      </w:r>
-    </w:p>
+    <w:sdt>
+      <w:sdtPr>
+        <w:rPr>
+          <w:rFonts w:ascii="Times New Roman" w:eastAsia="Times New Roman" w:hAnsi="Times New Roman" w:cs="Times New Roman"/>
+          <w:color w:val="auto"/>
+          <w:sz w:val="28"/>
+          <w:szCs w:val="28"/>
+        </w:rPr>
+        <w:id w:val="-325752373"/>
+        <w:docPartObj>
+          <w:docPartGallery w:val="Table of Contents"/>
+          <w:docPartUnique/>
+        </w:docPartObj>
+      </w:sdtPr>
+      <w:sdtEndPr>
+        <w:rPr>
+          <w:b/>
+          <w:bCs/>
+        </w:rPr>
+      </w:sdtEndPr>
+      <w:sdtContent>
+        <w:p>
+          <w:pPr>
+            <w:pStyle w:val="aa"/>
+            <w:jc w:val="center"/>
+            <w:rPr>
+              <w:rFonts w:ascii="Times New Roman" w:hAnsi="Times New Roman" w:cs="Times New Roman"/>
+              <w:color w:val="auto"/>
+              <w:sz w:val="28"/>
+              <w:szCs w:val="28"/>
+            </w:rPr>
+          </w:pPr>
+          <w:r>
+            <w:rPr>
+              <w:rFonts w:ascii="Times New Roman" w:hAnsi="Times New Roman" w:cs="Times New Roman"/>
+              <w:color w:val="auto"/>
+              <w:sz w:val="28"/>
+              <w:szCs w:val="28"/>
+            </w:rPr>
+            <w:t>ОГЛАВЛЕНИЕ</w:t>
+          </w:r>
+        </w:p>
+        <w:p>
+          <w:pPr>
+            <w:pStyle w:val="10"/>
+            <w:tabs>
+              <w:tab w:val="right" w:leader="dot" w:pos="9345"/>
+            </w:tabs>
+            <w:rPr>
+              <w:noProof/>
+            </w:rPr>
+          </w:pPr>
+          <w:r>
+            <w:fldChar w:fldCharType="begin"/>
+          </w:r>
+          <w:r>
+            <w:instrText xml:space="preserve"> TOC \o "1-3" \h \z \u </w:instrText>
+          </w:r>
+          <w:r>
+            <w:fldChar w:fldCharType="separate"/>
+          </w:r>
+          <w:hyperlink w:anchor="_Toc232273165" w:history="1">
+            <w:r>
+              <w:rPr>
+                <w:rStyle w:val="ab"/>
+                <w:noProof/>
+              </w:rPr>
+              <w:t>ВВЕДЕНИЕ</w:t>
+            </w:r>
+            <w:r>
+              <w:rPr>
+                <w:noProof/>
+                <w:webHidden/>
+              </w:rPr>
+              <w:tab/>
+            </w:r>
+            <w:r>
+              <w:rPr>
+                <w:noProof/>
+                <w:webHidden/>
+              </w:rPr>
+              <w:fldChar w:fldCharType="begin"/>
+            </w:r>
+            <w:r>
+              <w:rPr>
+                <w:noProof/>
+                <w:webHidden/>
+              </w:rPr>
+              <w:instrText xml:space="preserve"> PAGEREF _Toc232273165 \h </w:instrText>
+            </w:r>
+            <w:r>
+              <w:rPr>
+                <w:noProof/>
+                <w:webHidden/>
+              </w:rPr>
+            </w:r>
+            <w:r>
+              <w:rPr>
+                <w:noProof/>
+                <w:webHidden/>
+              </w:rPr>
+              <w:fldChar w:fldCharType="separate"/>
+            </w:r>
+            <w:r>
+              <w:rPr>
+                <w:noProof/>
+                <w:webHidden/>
+              </w:rPr>
+              <w:t>3</w:t>
+            </w:r>
+            <w:r>
+              <w:rPr>
+                <w:noProof/>
+                <w:webHidden/>
+              </w:rPr>
+              <w:fldChar w:fldCharType="end"/>
+            </w:r>
+          </w:hyperlink>
+        </w:p>
+        <w:p>
+          <w:pPr>
+            <w:pStyle w:val="10"/>
+            <w:tabs>
+              <w:tab w:val="right" w:leader="dot" w:pos="9345"/>
+            </w:tabs>
+            <w:rPr>
+              <w:noProof/>
+            </w:rPr>
+          </w:pPr>
+          <w:hyperlink w:anchor="_Toc232273166" w:history="1">
+            <w:r>
+              <w:rPr>
+                <w:rStyle w:val="ab"/>
+                <w:noProof/>
+              </w:rPr>
+              <w:t>Общая информация о проекте</w:t>
+            </w:r>
+            <w:r>
+              <w:rPr>
+                <w:noProof/>
+                <w:webHidden/>
+              </w:rPr>
+              <w:tab/>
+            </w:r>
+            <w:r>
+              <w:rPr>
+                <w:noProof/>
+                <w:webHidden/>
+              </w:rPr>
+              <w:fldChar w:fldCharType="begin"/>
+            </w:r>
+            <w:r>
+              <w:rPr>
+                <w:noProof/>
+                <w:webHidden/>
+              </w:rPr>
+              <w:instrText xml:space="preserve"> PAGEREF _Toc232273166 \h </w:instrText>
+            </w:r>
+            <w:r>
+              <w:rPr>
+                <w:noProof/>
+                <w:webHidden/>
+              </w:rPr>
+            </w:r>
+            <w:r>
+              <w:rPr>
+                <w:noProof/>
+                <w:webHidden/>
+              </w:rPr>
+              <w:fldChar w:fldCharType="separate"/>
+            </w:r>
+            <w:r>
+              <w:rPr>
+                <w:noProof/>
+                <w:webHidden/>
+              </w:rPr>
+              <w:t>3</w:t>
+            </w:r>
+            <w:r>
+              <w:rPr>
+                <w:noProof/>
+                <w:webHidden/>
+              </w:rPr>
+              <w:fldChar w:fldCharType="end"/>
+            </w:r>
+          </w:hyperlink>
+        </w:p>
+        <w:p>
+          <w:pPr>
+            <w:pStyle w:val="20"/>
+            <w:tabs>
+              <w:tab w:val="right" w:leader="dot" w:pos="9345"/>
+            </w:tabs>
+            <w:rPr>
+              <w:noProof/>
+            </w:rPr>
+          </w:pPr>
+          <w:hyperlink w:anchor="_Toc232273167" w:history="1">
+            <w:r>
+              <w:rPr>
+                <w:rStyle w:val="ab"/>
+                <w:noProof/>
+              </w:rPr>
+              <w:t>Название проекта</w:t>
+            </w:r>
+            <w:r>
+              <w:rPr>
+                <w:noProof/>
+                <w:webHidden/>
+              </w:rPr>
+              <w:tab/>
+            </w:r>
+            <w:r>
+              <w:rPr>
+                <w:noProof/>
+                <w:webHidden/>
+              </w:rPr>
+              <w:fldChar w:fldCharType="begin"/>
+            </w:r>
+            <w:r>
+              <w:rPr>
+                <w:noProof/>
+                <w:webHidden/>
+              </w:rPr>
+              <w:instrText xml:space="preserve"> PAGEREF _Toc232273167 \h </w:instrText>
+            </w:r>
+            <w:r>
+              <w:rPr>
+                <w:noProof/>
+                <w:webHidden/>
+              </w:rPr>
+            </w:r>
+            <w:r>
+              <w:rPr>
+                <w:noProof/>
+                <w:webHidden/>
+              </w:rPr>
+              <w:fldChar w:fldCharType="separate"/>
+            </w:r>
+            <w:r>
+              <w:rPr>
+                <w:noProof/>
+                <w:webHidden/>
+              </w:rPr>
+              <w:t>3</w:t>
+            </w:r>
+            <w:r>
+              <w:rPr>
+                <w:noProof/>
+                <w:webHidden/>
+              </w:rPr>
+              <w:fldChar w:fldCharType="end"/>
+            </w:r>
+          </w:hyperlink>
+        </w:p>
+        <w:p>
+          <w:pPr>
+            <w:pStyle w:val="20"/>
+            <w:tabs>
+              <w:tab w:val="right" w:leader="dot" w:pos="9345"/>
+            </w:tabs>
+            <w:rPr>
+              <w:noProof/>
+            </w:rPr>
+          </w:pPr>
+          <w:hyperlink w:anchor="_Toc232273168" w:history="1">
+            <w:r>
+              <w:rPr>
+                <w:rStyle w:val="ab"/>
+                <w:noProof/>
+              </w:rPr>
+              <w:t>Цели и задачи проекта</w:t>
+            </w:r>
+            <w:r>
+              <w:rPr>
+                <w:noProof/>
+                <w:webHidden/>
+              </w:rPr>
+              <w:tab/>
+            </w:r>
+            <w:r>
+              <w:rPr>
+                <w:noProof/>
+                <w:webHidden/>
+              </w:rPr>
+              <w:fldChar w:fldCharType="begin"/>
+            </w:r>
+            <w:r>
+              <w:rPr>
+                <w:noProof/>
+                <w:webHidden/>
+              </w:rPr>
+              <w:instrText xml:space="preserve"> PAGEREF _Toc232273168 \h </w:instrText>
+            </w:r>
+            <w:r>
+              <w:rPr>
+                <w:noProof/>
+                <w:webHidden/>
+              </w:rPr>
+            </w:r>
+            <w:r>
+              <w:rPr>
+                <w:noProof/>
+                <w:webHidden/>
+              </w:rPr>
+              <w:fldChar w:fldCharType="separate"/>
+            </w:r>
+            <w:r>
+              <w:rPr>
+                <w:noProof/>
+                <w:webHidden/>
+              </w:rPr>
+              <w:t>3</w:t>
+            </w:r>
+            <w:r>
+              <w:rPr>
+                <w:noProof/>
+                <w:webHidden/>
+              </w:rPr>
+              <w:fldChar w:fldCharType="end"/>
+            </w:r>
+          </w:hyperlink>
+        </w:p>
+        <w:p>
+          <w:pPr>
+            <w:pStyle w:val="10"/>
+            <w:tabs>
+              <w:tab w:val="right" w:leader="dot" w:pos="9345"/>
+            </w:tabs>
+            <w:rPr>
+              <w:noProof/>
+            </w:rPr>
+          </w:pPr>
+          <w:hyperlink w:anchor="_Toc232273169" w:history="1">
+            <w:r>
+              <w:rPr>
+                <w:rStyle w:val="ab"/>
+                <w:noProof/>
+              </w:rPr>
+              <w:t>Общая характеристика деятельности организации (заказчика проекта)</w:t>
+            </w:r>
+            <w:r>
+              <w:rPr>
+                <w:noProof/>
+                <w:webHidden/>
+              </w:rPr>
+              <w:tab/>
+            </w:r>
+            <w:r>
+              <w:rPr>
+                <w:noProof/>
+                <w:webHidden/>
+              </w:rPr>
+              <w:fldChar w:fldCharType="begin"/>
+            </w:r>
+            <w:r>
+              <w:rPr>
+                <w:noProof/>
+                <w:webHidden/>
+              </w:rPr>
+              <w:instrText xml:space="preserve"> PAGEREF _Toc232273169 \h </w:instrText>
+            </w:r>
+            <w:r>
+              <w:rPr>
+                <w:noProof/>
+                <w:webHidden/>
+              </w:rPr>
+            </w:r>
+            <w:r>
+              <w:rPr>
+                <w:noProof/>
+                <w:webHidden/>
+              </w:rPr>
+              <w:fldChar w:fldCharType="separate"/>
+            </w:r>
+            <w:r>
+              <w:rPr>
+                <w:noProof/>
+                <w:webHidden/>
+              </w:rPr>
+              <w:t>4</w:t>
+            </w:r>
+            <w:r>
+              <w:rPr>
+                <w:noProof/>
+                <w:webHidden/>
+              </w:rPr>
+              <w:fldChar w:fldCharType="end"/>
+            </w:r>
+          </w:hyperlink>
+        </w:p>
+        <w:p>
+          <w:pPr>
+            <w:pStyle w:val="20"/>
+            <w:tabs>
+              <w:tab w:val="right" w:leader="dot" w:pos="9345"/>
+            </w:tabs>
+            <w:rPr>
+              <w:noProof/>
+            </w:rPr>
+          </w:pPr>
+          <w:hyperlink w:anchor="_Toc232273170" w:history="1">
+            <w:r>
+              <w:rPr>
+                <w:rStyle w:val="ab"/>
+                <w:noProof/>
+              </w:rPr>
+              <w:t>Наименование заказчика</w:t>
+            </w:r>
+            <w:r>
+              <w:rPr>
+                <w:noProof/>
+                <w:webHidden/>
+              </w:rPr>
+              <w:tab/>
+            </w:r>
+            <w:r>
+              <w:rPr>
+                <w:noProof/>
+                <w:webHidden/>
+              </w:rPr>
+              <w:fldChar w:fldCharType="begin"/>
+            </w:r>
+            <w:r>
+              <w:rPr>
+                <w:noProof/>
+                <w:webHidden/>
+              </w:rPr>
+              <w:instrText xml:space="preserve"> PAGEREF _Toc232273170 \h </w:instrText>
+            </w:r>
+            <w:r>
+              <w:rPr>
+                <w:noProof/>
+                <w:webHidden/>
+              </w:rPr>
+            </w:r>
+            <w:r>
+              <w:rPr>
+                <w:noProof/>
+                <w:webHidden/>
+              </w:rPr>
+              <w:fldChar w:fldCharType="separate"/>
+            </w:r>
+            <w:r>
+              <w:rPr>
+                <w:noProof/>
+                <w:webHidden/>
+              </w:rPr>
+              <w:t>4</w:t>
+            </w:r>
+            <w:r>
+              <w:rPr>
+                <w:noProof/>
+                <w:webHidden/>
+              </w:rPr>
+              <w:fldChar w:fldCharType="end"/>
+            </w:r>
+          </w:hyperlink>
+        </w:p>
+        <w:p>
+          <w:pPr>
+            <w:pStyle w:val="20"/>
+            <w:tabs>
+              <w:tab w:val="right" w:leader="dot" w:pos="9345"/>
+            </w:tabs>
+            <w:rPr>
+              <w:noProof/>
+            </w:rPr>
+          </w:pPr>
+          <w:hyperlink w:anchor="_Toc232273171" w:history="1">
+            <w:r>
+              <w:rPr>
+                <w:rStyle w:val="ab"/>
+                <w:noProof/>
+              </w:rPr>
+              <w:t>Организационная структура</w:t>
+            </w:r>
+            <w:r>
+              <w:rPr>
+                <w:noProof/>
+                <w:webHidden/>
+              </w:rPr>
+              <w:tab/>
+            </w:r>
+            <w:r>
+              <w:rPr>
+                <w:noProof/>
+                <w:webHidden/>
+              </w:rPr>
+              <w:fldChar w:fldCharType="begin"/>
+            </w:r>
+            <w:r>
+              <w:rPr>
+                <w:noProof/>
+                <w:webHidden/>
+              </w:rPr>
+              <w:instrText xml:space="preserve"> PAGEREF _Toc232273171 \h </w:instrText>
+            </w:r>
+            <w:r>
+              <w:rPr>
+                <w:noProof/>
+                <w:webHidden/>
+              </w:rPr>
+            </w:r>
+            <w:r>
+              <w:rPr>
+                <w:noProof/>
+                <w:webHidden/>
+              </w:rPr>
+              <w:fldChar w:fldCharType="separate"/>
+            </w:r>
+            <w:r>
+              <w:rPr>
+                <w:noProof/>
+                <w:webHidden/>
+              </w:rPr>
+              <w:t>4</w:t>
+            </w:r>
+            <w:r>
+              <w:rPr>
+                <w:noProof/>
+                <w:webHidden/>
+              </w:rPr>
+              <w:fldChar w:fldCharType="end"/>
+            </w:r>
+          </w:hyperlink>
+        </w:p>
+        <w:p>
+          <w:pPr>
+            <w:pStyle w:val="20"/>
+            <w:tabs>
+              <w:tab w:val="right" w:leader="dot" w:pos="9345"/>
+            </w:tabs>
+            <w:rPr>
+              <w:noProof/>
+            </w:rPr>
+          </w:pPr>
+          <w:hyperlink w:anchor="_Toc232273172" w:history="1">
+            <w:r>
+              <w:rPr>
+                <w:rStyle w:val="ab"/>
+                <w:noProof/>
+              </w:rPr>
+              <w:t>Описание деятельности</w:t>
+            </w:r>
+            <w:r>
+              <w:rPr>
+                <w:noProof/>
+                <w:webHidden/>
+              </w:rPr>
+              <w:tab/>
+            </w:r>
+            <w:r>
+              <w:rPr>
+                <w:noProof/>
+                <w:webHidden/>
+              </w:rPr>
+              <w:fldChar w:fldCharType="begin"/>
+            </w:r>
+            <w:r>
+              <w:rPr>
+                <w:noProof/>
+                <w:webHidden/>
+              </w:rPr>
+              <w:instrText xml:space="preserve"> PAGEREF _Toc232273172 \h </w:instrText>
+            </w:r>
+            <w:r>
+              <w:rPr>
+                <w:noProof/>
+                <w:webHidden/>
+              </w:rPr>
+            </w:r>
+            <w:r>
+              <w:rPr>
+                <w:noProof/>
+                <w:webHidden/>
+              </w:rPr>
+              <w:fldChar w:fldCharType="separate"/>
+            </w:r>
+            <w:r>
+              <w:rPr>
+                <w:noProof/>
+                <w:webHidden/>
+              </w:rPr>
+              <w:t>4</w:t>
+            </w:r>
+            <w:r>
+              <w:rPr>
+                <w:noProof/>
+                <w:webHidden/>
+              </w:rPr>
+              <w:fldChar w:fldCharType="end"/>
+            </w:r>
+          </w:hyperlink>
+        </w:p>
+        <w:p>
+          <w:pPr>
+            <w:pStyle w:val="10"/>
+            <w:tabs>
+              <w:tab w:val="right" w:leader="dot" w:pos="9345"/>
+            </w:tabs>
+            <w:rPr>
+              <w:noProof/>
+            </w:rPr>
+          </w:pPr>
+          <w:hyperlink w:anchor="_Toc232273173" w:history="1">
+            <w:r>
+              <w:rPr>
+                <w:rStyle w:val="ab"/>
+                <w:noProof/>
+              </w:rPr>
+              <w:t>Описание задания по проектной практике</w:t>
+            </w:r>
+            <w:r>
+              <w:rPr>
+                <w:noProof/>
+                <w:webHidden/>
+              </w:rPr>
+              <w:tab/>
+            </w:r>
+            <w:r>
+              <w:rPr>
+                <w:noProof/>
+                <w:webHidden/>
+              </w:rPr>
+              <w:fldChar w:fldCharType="begin"/>
+            </w:r>
+            <w:r>
+              <w:rPr>
+                <w:noProof/>
+                <w:webHidden/>
+              </w:rPr>
+              <w:instrText xml:space="preserve"> PAGEREF _Toc232273173 \h </w:instrText>
+            </w:r>
+            <w:r>
+              <w:rPr>
+                <w:noProof/>
+                <w:webHidden/>
+              </w:rPr>
+            </w:r>
+            <w:r>
+              <w:rPr>
+                <w:noProof/>
+                <w:webHidden/>
+              </w:rPr>
+              <w:fldChar w:fldCharType="separate"/>
+            </w:r>
+            <w:r>
+              <w:rPr>
+                <w:noProof/>
+                <w:webHidden/>
+              </w:rPr>
+              <w:t>5</w:t>
+            </w:r>
+            <w:r>
+              <w:rPr>
+                <w:noProof/>
+                <w:webHidden/>
+              </w:rPr>
+              <w:fldChar w:fldCharType="end"/>
+            </w:r>
+          </w:hyperlink>
+        </w:p>
+        <w:p>
+          <w:pPr>
+            <w:pStyle w:val="10"/>
+            <w:tabs>
+              <w:tab w:val="right" w:leader="dot" w:pos="9345"/>
+            </w:tabs>
+            <w:rPr>
+              <w:noProof/>
+            </w:rPr>
+          </w:pPr>
+          <w:hyperlink w:anchor="_Toc232273174" w:history="1">
+            <w:r>
+              <w:rPr>
+                <w:rStyle w:val="ab"/>
+                <w:noProof/>
+              </w:rPr>
+              <w:t>Описание достигнутых результатов по проектной практике</w:t>
+            </w:r>
+            <w:r>
+              <w:rPr>
+                <w:noProof/>
+                <w:webHidden/>
+              </w:rPr>
+              <w:tab/>
+            </w:r>
+            <w:r>
+              <w:rPr>
+                <w:noProof/>
+                <w:webHidden/>
+              </w:rPr>
+              <w:fldChar w:fldCharType="begin"/>
+            </w:r>
+            <w:r>
+              <w:rPr>
+                <w:noProof/>
+                <w:webHidden/>
+              </w:rPr>
+              <w:instrText xml:space="preserve"> PAGEREF _Toc232273174 \h </w:instrText>
+            </w:r>
+            <w:r>
+              <w:rPr>
+                <w:noProof/>
+                <w:webHidden/>
+              </w:rPr>
+            </w:r>
+            <w:r>
+              <w:rPr>
+                <w:noProof/>
+                <w:webHidden/>
+              </w:rPr>
+              <w:fldChar w:fldCharType="separate"/>
+            </w:r>
+            <w:r>
+              <w:rPr>
+                <w:noProof/>
+                <w:webHidden/>
+              </w:rPr>
+              <w:t>5</w:t>
+            </w:r>
+            <w:r>
+              <w:rPr>
+                <w:noProof/>
+                <w:webHidden/>
+              </w:rPr>
+              <w:fldChar w:fldCharType="end"/>
+            </w:r>
+          </w:hyperlink>
+        </w:p>
+        <w:p>
+          <w:pPr>
+            <w:pStyle w:val="20"/>
+            <w:tabs>
+              <w:tab w:val="right" w:leader="dot" w:pos="9345"/>
+            </w:tabs>
+            <w:rPr>
+              <w:noProof/>
+            </w:rPr>
+          </w:pPr>
+          <w:hyperlink w:anchor="_Toc232273175" w:history="1">
+            <w:r>
+              <w:rPr>
+                <w:rStyle w:val="ab"/>
+                <w:noProof/>
+              </w:rPr>
+              <w:t>1. Работа с Git и репозиторием</w:t>
+            </w:r>
+            <w:r>
+              <w:rPr>
+                <w:noProof/>
+                <w:webHidden/>
+              </w:rPr>
+              <w:tab/>
+            </w:r>
+            <w:r>
+              <w:rPr>
+                <w:noProof/>
+                <w:webHidden/>
+              </w:rPr>
+              <w:fldChar w:fldCharType="begin"/>
+            </w:r>
+            <w:r>
+              <w:rPr>
+                <w:noProof/>
+                <w:webHidden/>
+              </w:rPr>
+              <w:instrText xml:space="preserve"> PAGEREF _Toc232273175 \h </w:instrText>
+            </w:r>
+            <w:r>
+              <w:rPr>
+                <w:noProof/>
+                <w:webHidden/>
+              </w:rPr>
+            </w:r>
+            <w:r>
+              <w:rPr>
+                <w:noProof/>
+                <w:webHidden/>
+              </w:rPr>
+              <w:fldChar w:fldCharType="separate"/>
+            </w:r>
+            <w:r>
+              <w:rPr>
+                <w:noProof/>
+                <w:webHidden/>
+              </w:rPr>
+              <w:t>5</w:t>
+            </w:r>
+            <w:r>
+              <w:rPr>
+                <w:noProof/>
+                <w:webHidden/>
+              </w:rPr>
+              <w:fldChar w:fldCharType="end"/>
+            </w:r>
+          </w:hyperlink>
+        </w:p>
+        <w:p>
+          <w:pPr>
+            <w:pStyle w:val="20"/>
+            <w:tabs>
+              <w:tab w:val="right" w:leader="dot" w:pos="9345"/>
+            </w:tabs>
+            <w:rPr>
+              <w:noProof/>
+            </w:rPr>
+          </w:pPr>
+          <w:hyperlink w:anchor="_Toc232273176" w:history="1">
+            <w:r>
+              <w:rPr>
+                <w:rStyle w:val="ab"/>
+                <w:noProof/>
+              </w:rPr>
+              <w:t>2. Документация в формате Markdown</w:t>
+            </w:r>
+            <w:r>
+              <w:rPr>
+                <w:noProof/>
+                <w:webHidden/>
+              </w:rPr>
+              <w:tab/>
+            </w:r>
+            <w:r>
+              <w:rPr>
+                <w:noProof/>
+                <w:webHidden/>
+              </w:rPr>
+              <w:fldChar w:fldCharType="begin"/>
+            </w:r>
+            <w:r>
+              <w:rPr>
+                <w:noProof/>
+                <w:webHidden/>
+              </w:rPr>
+              <w:instrText xml:space="preserve"> PAGEREF _Toc232273176 \h </w:instrText>
+            </w:r>
+            <w:r>
+              <w:rPr>
+                <w:noProof/>
+                <w:webHidden/>
+              </w:rPr>
+            </w:r>
+            <w:r>
+              <w:rPr>
+                <w:noProof/>
+                <w:webHidden/>
+              </w:rPr>
+              <w:fldChar w:fldCharType="separate"/>
+            </w:r>
+            <w:r>
+              <w:rPr>
+                <w:noProof/>
+                <w:webHidden/>
+              </w:rPr>
+              <w:t>6</w:t>
+            </w:r>
+            <w:r>
+              <w:rPr>
+                <w:noProof/>
+                <w:webHidden/>
+              </w:rPr>
+              <w:fldChar w:fldCharType="end"/>
+            </w:r>
+          </w:hyperlink>
+        </w:p>
+        <w:p>
+          <w:pPr>
+            <w:pStyle w:val="20"/>
+            <w:tabs>
+              <w:tab w:val="right" w:leader="dot" w:pos="9345"/>
+            </w:tabs>
+            <w:rPr>
+              <w:noProof/>
+            </w:rPr>
+          </w:pPr>
+          <w:hyperlink w:anchor="_Toc232273177" w:history="1">
+            <w:r>
+              <w:rPr>
+                <w:rStyle w:val="ab"/>
+                <w:noProof/>
+              </w:rPr>
+              <w:t>3. Создание статического веб-сайта на Hugo</w:t>
+            </w:r>
+            <w:r>
+              <w:rPr>
+                <w:noProof/>
+                <w:webHidden/>
+              </w:rPr>
+              <w:tab/>
+            </w:r>
+            <w:r>
+              <w:rPr>
+                <w:noProof/>
+                <w:webHidden/>
+              </w:rPr>
+              <w:fldChar w:fldCharType="begin"/>
+            </w:r>
+            <w:r>
+              <w:rPr>
+                <w:noProof/>
+                <w:webHidden/>
+              </w:rPr>
+              <w:instrText xml:space="preserve"> PAGEREF _Toc232273177 \h </w:instrText>
+            </w:r>
+            <w:r>
+              <w:rPr>
+                <w:noProof/>
+                <w:webHidden/>
+              </w:rPr>
+            </w:r>
+            <w:r>
+              <w:rPr>
+                <w:noProof/>
+                <w:webHidden/>
+              </w:rPr>
+              <w:fldChar w:fldCharType="separate"/>
+            </w:r>
+            <w:r>
+              <w:rPr>
+                <w:noProof/>
+                <w:webHidden/>
+              </w:rPr>
+              <w:t>6</w:t>
+            </w:r>
+            <w:r>
+              <w:rPr>
+                <w:noProof/>
+                <w:webHidden/>
+              </w:rPr>
+              <w:fldChar w:fldCharType="end"/>
+            </w:r>
+          </w:hyperlink>
+        </w:p>
+        <w:p>
+          <w:pPr>
+            <w:pStyle w:val="20"/>
+            <w:tabs>
+              <w:tab w:val="right" w:leader="dot" w:pos="9345"/>
+            </w:tabs>
+            <w:rPr>
+              <w:noProof/>
+            </w:rPr>
+          </w:pPr>
+          <w:hyperlink w:anchor="_Toc232273178" w:history="1">
+            <w:r>
+              <w:rPr>
+                <w:rStyle w:val="ab"/>
+                <w:noProof/>
+              </w:rPr>
+              <w:t>4. Подготовка отчёта по практике</w:t>
+            </w:r>
+            <w:r>
+              <w:rPr>
+                <w:noProof/>
+                <w:webHidden/>
+              </w:rPr>
+              <w:tab/>
+            </w:r>
+            <w:r>
+              <w:rPr>
+                <w:noProof/>
+                <w:webHidden/>
+              </w:rPr>
+              <w:fldChar w:fldCharType="begin"/>
+            </w:r>
+            <w:r>
+              <w:rPr>
+                <w:noProof/>
+                <w:webHidden/>
+              </w:rPr>
+              <w:instrText xml:space="preserve"> PAGEREF _Toc232273178 \h </w:instrText>
+            </w:r>
+            <w:r>
+              <w:rPr>
+                <w:noProof/>
+                <w:webHidden/>
+              </w:rPr>
+            </w:r>
+            <w:r>
+              <w:rPr>
+                <w:noProof/>
+                <w:webHidden/>
+              </w:rPr>
+              <w:fldChar w:fldCharType="separate"/>
+            </w:r>
+            <w:r>
+              <w:rPr>
+                <w:noProof/>
+                <w:webHidden/>
+              </w:rPr>
+              <w:t>8</w:t>
+            </w:r>
+            <w:r>
+              <w:rPr>
+                <w:noProof/>
+                <w:webHidden/>
+              </w:rPr>
+              <w:fldChar w:fldCharType="end"/>
+            </w:r>
+          </w:hyperlink>
+        </w:p>
+        <w:p>
+          <w:pPr>
+            <w:pStyle w:val="10"/>
+            <w:tabs>
+              <w:tab w:val="right" w:leader="dot" w:pos="9345"/>
+            </w:tabs>
+            <w:rPr>
+              <w:noProof/>
+            </w:rPr>
+          </w:pPr>
+          <w:hyperlink w:anchor="_Toc232273179" w:history="1">
+            <w:r>
+              <w:rPr>
+                <w:rStyle w:val="ab"/>
+                <w:noProof/>
+              </w:rPr>
+              <w:t>ЗАКЛЮЧЕНИЕ</w:t>
+            </w:r>
+            <w:r>
+              <w:rPr>
+                <w:noProof/>
+                <w:webHidden/>
+              </w:rPr>
+              <w:tab/>
+            </w:r>
+            <w:r>
+              <w:rPr>
+                <w:noProof/>
+                <w:webHidden/>
+              </w:rPr>
+              <w:fldChar w:fldCharType="begin"/>
+            </w:r>
+            <w:r>
+              <w:rPr>
+                <w:noProof/>
+                <w:webHidden/>
+              </w:rPr>
+              <w:instrText xml:space="preserve"> PAGEREF _Toc232273179 \h </w:instrText>
+            </w:r>
+            <w:r>
+              <w:rPr>
+                <w:noProof/>
+                <w:webHidden/>
+              </w:rPr>
+            </w:r>
+            <w:r>
+              <w:rPr>
+                <w:noProof/>
+                <w:webHidden/>
+              </w:rPr>
+              <w:fldChar w:fldCharType="separate"/>
+            </w:r>
+            <w:r>
+              <w:rPr>
+                <w:noProof/>
+                <w:webHidden/>
+              </w:rPr>
+              <w:t>8</w:t>
+            </w:r>
+            <w:r>
+              <w:rPr>
+                <w:noProof/>
+                <w:webHidden/>
+              </w:rPr>
+              <w:fldChar w:fldCharType="end"/>
+            </w:r>
+          </w:hyperlink>
+        </w:p>
+        <w:p>
+          <w:pPr>
+            <w:pStyle w:val="10"/>
+            <w:tabs>
+              <w:tab w:val="right" w:leader="dot" w:pos="9345"/>
+            </w:tabs>
+            <w:rPr>
+              <w:noProof/>
+            </w:rPr>
+          </w:pPr>
+          <w:hyperlink w:anchor="_Toc232273180" w:history="1">
+            <w:r>
+              <w:rPr>
+                <w:rStyle w:val="ab"/>
+                <w:noProof/>
+              </w:rPr>
+              <w:t>СПИСОК ИСПОЛЬЗОВАННОЙ ЛИТЕРАТУРЫ</w:t>
+            </w:r>
+            <w:r>
+              <w:rPr>
+                <w:noProof/>
+                <w:webHidden/>
+              </w:rPr>
+              <w:tab/>
+            </w:r>
+            <w:r>
+              <w:rPr>
+                <w:noProof/>
+                <w:webHidden/>
+              </w:rPr>
+              <w:fldChar w:fldCharType="begin"/>
+            </w:r>
+            <w:r>
+              <w:rPr>
+                <w:noProof/>
+                <w:webHidden/>
+              </w:rPr>
+              <w:instrText xml:space="preserve"> PAGEREF _Toc232273180 \h </w:instrText>
+            </w:r>
+            <w:r>
+              <w:rPr>
+                <w:noProof/>
+                <w:webHidden/>
+              </w:rPr>
+            </w:r>
+            <w:r>
+              <w:rPr>
+                <w:noProof/>
+                <w:webHidden/>
+              </w:rPr>
+              <w:fldChar w:fldCharType="separate"/>
+            </w:r>
+            <w:r>
+              <w:rPr>
+                <w:noProof/>
+                <w:webHidden/>
+              </w:rPr>
+              <w:t>8</w:t>
+            </w:r>
+            <w:r>
+              <w:rPr>
+                <w:noProof/>
+                <w:webHidden/>
+              </w:rPr>
+              <w:fldChar w:fldCharType="end"/>
+            </w:r>
+          </w:hyperlink>
+        </w:p>
+        <w:p>
+          <w:pPr>
+            <w:pStyle w:val="10"/>
+            <w:tabs>
+              <w:tab w:val="right" w:leader="dot" w:pos="9345"/>
+            </w:tabs>
+            <w:rPr>
+              <w:noProof/>
+            </w:rPr>
+          </w:pPr>
+          <w:hyperlink w:anchor="_Toc232273181" w:history="1">
+            <w:r>
+              <w:rPr>
+                <w:rStyle w:val="ab"/>
+                <w:noProof/>
+              </w:rPr>
+              <w:t>ПРИЛОЖЕНИЯ</w:t>
+            </w:r>
+            <w:r>
+              <w:rPr>
+                <w:noProof/>
+                <w:webHidden/>
+              </w:rPr>
+              <w:tab/>
+            </w:r>
+            <w:r>
+              <w:rPr>
+                <w:noProof/>
+                <w:webHidden/>
+              </w:rPr>
+              <w:fldChar w:fldCharType="begin"/>
+            </w:r>
+            <w:r>
+              <w:rPr>
+                <w:noProof/>
+                <w:webHidden/>
+              </w:rPr>
+              <w:instrText xml:space="preserve"> PAGEREF _Toc232273181 \h </w:instrText>
+            </w:r>
+            <w:r>
+              <w:rPr>
+                <w:noProof/>
+                <w:webHidden/>
+              </w:rPr>
+            </w:r>
+            <w:r>
+              <w:rPr>
+                <w:noProof/>
+                <w:webHidden/>
+              </w:rPr>
+              <w:fldChar w:fldCharType="separate"/>
+            </w:r>
+            <w:r>
+              <w:rPr>
+                <w:noProof/>
+                <w:webHidden/>
+              </w:rPr>
+              <w:t>9</w:t>
+            </w:r>
+            <w:r>
+              <w:rPr>
+                <w:noProof/>
+                <w:webHidden/>
+              </w:rPr>
+              <w:fldChar w:fldCharType="end"/>
+            </w:r>
+          </w:hyperlink>
+        </w:p>
+        <w:p>
+          <w:r>
+            <w:rPr>
+              <w:b/>
+              <w:bCs/>
+            </w:rPr>
+            <w:fldChar w:fldCharType="end"/>
+          </w:r>
+        </w:p>
+      </w:sdtContent>
+    </w:sdt>
     <w:p>
       <w:r>
         <w:br w:type="page"/>
@@ -402,10 +1423,12 @@
         <w:spacing w:before="240" w:after="120"/>
         <w:jc w:val="center"/>
       </w:pPr>
+      <w:bookmarkStart w:id="0" w:name="_Toc232273165"/>
       <w:r>
         <w:lastRenderedPageBreak/>
         <w:t>ВВЕДЕНИЕ</w:t>
       </w:r>
+      <w:bookmarkEnd w:id="0"/>
     </w:p>
     <w:p>
       <w:pPr>
@@ -447,23 +1470,6 @@
       <w:proofErr w:type="spellEnd"/>
       <w:r>
         <w:t>. Агрегатор лучших предложений на рынке».</w:t>
-      </w:r>
-    </w:p>
-    <w:p>
-      <w:pPr>
-        <w:ind w:firstLine="709"/>
-        <w:jc w:val="both"/>
-      </w:pPr>
-      <w:r>
-        <w:t xml:space="preserve">В отчёте последовательно описаны выполненные задачи базовой части задания (пункты 1, 2, 3 и 5): настройка репозитория и работа с </w:t>
-      </w:r>
-      <w:proofErr w:type="spellStart"/>
-      <w:r>
-        <w:t>Git</w:t>
-      </w:r>
-      <w:proofErr w:type="spellEnd"/>
-      <w:r>
-        <w:t>, подготовка документации, разработка сайта проекта и формирование итогового отчёта.</w:t>
       </w:r>
     </w:p>
     <w:p>
@@ -472,18 +1478,22 @@
         <w:spacing w:before="240" w:after="120"/>
         <w:jc w:val="center"/>
       </w:pPr>
+      <w:bookmarkStart w:id="1" w:name="_Toc232273166"/>
       <w:r>
         <w:t>Общая информация о проекте</w:t>
       </w:r>
+      <w:bookmarkEnd w:id="1"/>
     </w:p>
     <w:p>
       <w:pPr>
         <w:pStyle w:val="2"/>
         <w:spacing w:before="120" w:after="60"/>
       </w:pPr>
+      <w:bookmarkStart w:id="2" w:name="_Toc232273167"/>
       <w:r>
         <w:t>Название проекта</w:t>
       </w:r>
+      <w:bookmarkEnd w:id="2"/>
     </w:p>
     <w:p>
       <w:pPr>
@@ -507,9 +1517,11 @@
         <w:pStyle w:val="2"/>
         <w:spacing w:before="120" w:after="60"/>
       </w:pPr>
+      <w:bookmarkStart w:id="3" w:name="_Toc232273168"/>
       <w:r>
         <w:t>Цели и задачи проекта</w:t>
       </w:r>
+      <w:bookmarkEnd w:id="3"/>
     </w:p>
     <w:p>
       <w:pPr>
@@ -556,7 +1568,6 @@
         <w:jc w:val="both"/>
       </w:pPr>
       <w:r>
-        <w:lastRenderedPageBreak/>
         <w:t>разработка архитектуры платформы и пользовательского сценария;</w:t>
       </w:r>
     </w:p>
@@ -596,6 +1607,7 @@
         <w:jc w:val="both"/>
       </w:pPr>
       <w:r>
+        <w:lastRenderedPageBreak/>
         <w:t>анализ рисков и перспектив развития проекта.</w:t>
       </w:r>
     </w:p>
@@ -605,18 +1617,22 @@
         <w:spacing w:before="240" w:after="120"/>
         <w:jc w:val="center"/>
       </w:pPr>
+      <w:bookmarkStart w:id="4" w:name="_Toc232273169"/>
       <w:r>
         <w:t>Общая характеристика деятельности организации (заказчика проекта)</w:t>
       </w:r>
+      <w:bookmarkEnd w:id="4"/>
     </w:p>
     <w:p>
       <w:pPr>
         <w:pStyle w:val="2"/>
         <w:spacing w:before="120" w:after="60"/>
       </w:pPr>
+      <w:bookmarkStart w:id="5" w:name="_Toc232273170"/>
       <w:r>
         <w:t>Наименование заказчика</w:t>
       </w:r>
+      <w:bookmarkEnd w:id="5"/>
     </w:p>
     <w:p>
       <w:pPr>
@@ -638,9 +1654,11 @@
         <w:pStyle w:val="2"/>
         <w:spacing w:before="120" w:after="60"/>
       </w:pPr>
+      <w:bookmarkStart w:id="6" w:name="_Toc232273171"/>
       <w:r>
         <w:t>Организационная структура</w:t>
       </w:r>
+      <w:bookmarkEnd w:id="6"/>
     </w:p>
     <w:p>
       <w:pPr>
@@ -648,7 +1666,7 @@
         <w:jc w:val="both"/>
       </w:pPr>
       <w:r>
-        <w:t xml:space="preserve">Работа выполняется командой студентов группы 253-331 под руководством куратора проектной деятельности и ответственного за практику. Внутри команды распределены роли и зоны ответственности, что обеспечивает разделение труда:</w:t>
+        <w:t>Работа выполняется командой студентов группы 253-331 под руководством куратора проектной деятельности и ответственного за практику. Внутри команды распределены роли и зоны ответственности, что обеспечивает разделение труда:</w:t>
       </w:r>
     </w:p>
     <w:p>
@@ -661,7 +1679,7 @@
         <w:jc w:val="both"/>
       </w:pPr>
       <w:r>
-        <w:t xml:space="preserve">Шоимхожиев У.Н. (Development Lead) — создание и администрация Git-репозитория, настройка правил работы с ветками, разработка шаблонов Hugo, текстовое наполнение сайта и подготовка документации в формате Markdown;</w:t>
+        <w:t>Шоимхожиев У.Н. (Development Lead) — создание и администрация Git-репозитория, настройка правил работы с ветками, разработка шаблонов Hugo, текстовое наполнение сайта и подготовка документации в формате Markdown;</w:t>
       </w:r>
     </w:p>
     <w:p>
@@ -674,7 +1692,7 @@
         <w:jc w:val="both"/>
       </w:pPr>
       <w:r>
-        <w:t xml:space="preserve">Хачатрян М.С. (Frontend Dev/Designer) — концепция пользовательского интерфейса, визуальный стиль и фирменные цвета, вёрстка кастомной темы Hugo (CSS), оформление схем и медиа-материалов;</w:t>
+        <w:t>Хачатрян М.С. (Frontend Dev/Designer) — концепция пользовательского интерфейса, визуальный стиль и фирменные цвета, вёрстка кастомной темы Hugo (CSS), оформление схем и медиа-материалов;</w:t>
       </w:r>
     </w:p>
     <w:p>
@@ -687,7 +1705,7 @@
         <w:jc w:val="both"/>
       </w:pPr>
       <w:r>
-        <w:t xml:space="preserve">Изотенков М.В. (Product Owner) — планирование работ и распределение задач, проектирование структуры репозитория, ведение журнала прогресса и составление отчёта по практике.</w:t>
+        <w:t>Изотенков М.В. (Product Owner) — планирование работ и распределение задач, проектирование структуры репозитория, ведение журнала прогресса и составление отчёта по практике.</w:t>
       </w:r>
     </w:p>
     <w:p>
@@ -695,9 +1713,11 @@
         <w:pStyle w:val="2"/>
         <w:spacing w:before="120" w:after="60"/>
       </w:pPr>
+      <w:bookmarkStart w:id="7" w:name="_Toc232273172"/>
       <w:r>
         <w:t>Описание деятельности</w:t>
       </w:r>
+      <w:bookmarkEnd w:id="7"/>
     </w:p>
     <w:p>
       <w:pPr>
@@ -705,7 +1725,7 @@
         <w:jc w:val="both"/>
       </w:pPr>
       <w:r>
-        <w:t>Московский Политех — высшее учебное заведение, ведущее подготовку специалистов в области информационных технологий и информационной безопасности. В рамках дисциплины «Проектная деятельность» студенты разрабатывают собственные проекты, приобретая навыки командной работы, проектирования и документирования.</w:t>
+        <w:t>Московский Политех — высшее учебное заведение, ведущее подготовку специалистов в области информационных технологий; в рамках дисциплины «Проектная деятельность» студенты разрабатывают собственные проекты, приобретая навыки командной работы и документирования.</w:t>
       </w:r>
     </w:p>
     <w:p>
@@ -714,9 +1734,12 @@
         <w:spacing w:before="240" w:after="120"/>
         <w:jc w:val="center"/>
       </w:pPr>
-      <w:r>
+      <w:bookmarkStart w:id="8" w:name="_Toc232273173"/>
+      <w:r>
+        <w:lastRenderedPageBreak/>
         <w:t>Описание задания по проектной практике</w:t>
       </w:r>
+      <w:bookmarkEnd w:id="8"/>
     </w:p>
     <w:p>
       <w:pPr>
@@ -724,84 +1747,7 @@
         <w:jc w:val="both"/>
       </w:pPr>
       <w:r>
-        <w:t>В рамках базовой части задания были выполнены следующие пункты:</w:t>
-      </w:r>
-    </w:p>
-    <w:p>
-      <w:pPr>
-        <w:pStyle w:val="a4"/>
-        <w:numPr>
-          <w:ilvl w:val="0"/>
-          <w:numId w:val="2"/>
-        </w:numPr>
-        <w:jc w:val="both"/>
-      </w:pPr>
-      <w:r>
-        <w:t xml:space="preserve">Настройка </w:t>
-      </w:r>
-      <w:proofErr w:type="spellStart"/>
-      <w:r>
-        <w:t>Git</w:t>
-      </w:r>
-      <w:proofErr w:type="spellEnd"/>
-      <w:r>
-        <w:t xml:space="preserve"> и репозитория: создание репозитория на </w:t>
-      </w:r>
-      <w:proofErr w:type="spellStart"/>
-      <w:r>
-        <w:t>GitHub</w:t>
-      </w:r>
-      <w:proofErr w:type="spellEnd"/>
-      <w:r>
-        <w:t xml:space="preserve"> на основе шаблона, освоение базовых команд и регулярная фиксация изменений осмысленными коммитами. </w:t>
-      </w:r>
-    </w:p>
-    <w:p>
-      <w:pPr>
-        <w:pStyle w:val="a4"/>
-        <w:numPr>
-          <w:ilvl w:val="0"/>
-          <w:numId w:val="2"/>
-        </w:numPr>
-        <w:jc w:val="both"/>
-      </w:pPr>
-      <w:r>
-        <w:t xml:space="preserve">Подготовка документации в формате </w:t>
-      </w:r>
-      <w:proofErr w:type="spellStart"/>
-      <w:r>
-        <w:t>Markdown</w:t>
-      </w:r>
-      <w:proofErr w:type="spellEnd"/>
-      <w:r>
-        <w:t>: оформление описания проекта, журнала прогресса и сведений об участниках.</w:t>
-      </w:r>
-    </w:p>
-    <w:p>
-      <w:pPr>
-        <w:pStyle w:val="a4"/>
-        <w:numPr>
-          <w:ilvl w:val="0"/>
-          <w:numId w:val="2"/>
-        </w:numPr>
-        <w:jc w:val="both"/>
-      </w:pPr>
-      <w:r>
-        <w:lastRenderedPageBreak/>
-        <w:t>Создание статического веб-сайта проекта средствами Hugo с уникальным оформлением и обязательными разделами.</w:t>
-      </w:r>
-    </w:p>
-    <w:p>
-      <w:pPr>
-        <w:pStyle w:val="a4"/>
-        <w:numPr>
-          <w:ilvl w:val="0"/>
-          <w:numId w:val="2"/>
-        </w:numPr>
-        <w:jc w:val="both"/>
-      </w:pPr>
-      <w:r>
-        <w:t>Формирование отчёта по практике в форматах DOCX и PDF на основе утверждённого шаблона.</w:t>
+        <w:t>В рамках базовой части задания требовалось: настроить Git и репозиторий с регулярной фиксацией изменений осмысленными коммитами; подготовить документацию в формате Markdown; создать статический веб-сайт проекта средствами Hugo с уникальным оформлением и обязательными разделами; сформировать отчёт по практике в форматах DOCX и PDF на основе утверждённого шаблона.</w:t>
       </w:r>
     </w:p>
     <w:p>
@@ -810,15 +1756,18 @@
         <w:spacing w:before="240" w:after="120"/>
         <w:jc w:val="center"/>
       </w:pPr>
+      <w:bookmarkStart w:id="9" w:name="_Toc232273174"/>
       <w:r>
         <w:t>Описание достигнутых результатов по проектной практике</w:t>
       </w:r>
+      <w:bookmarkEnd w:id="9"/>
     </w:p>
     <w:p>
       <w:pPr>
         <w:pStyle w:val="2"/>
         <w:spacing w:before="120" w:after="60"/>
       </w:pPr>
+      <w:bookmarkStart w:id="10" w:name="_Toc232273175"/>
       <w:r>
         <w:t xml:space="preserve">1. Работа с </w:t>
       </w:r>
@@ -830,6 +1779,7 @@
       <w:r>
         <w:t xml:space="preserve"> и репозиторием</w:t>
       </w:r>
+      <w:bookmarkEnd w:id="10"/>
     </w:p>
     <w:p>
       <w:pPr>
@@ -1059,13 +2009,18 @@
       </w:r>
       <w:proofErr w:type="spellEnd"/>
       <w:r>
-        <w:t>) и настроен файл .</w:t>
+        <w:t xml:space="preserve">) и настроен </w:t>
+      </w:r>
+      <w:proofErr w:type="gramStart"/>
+      <w:r>
+        <w:t>файл .</w:t>
       </w:r>
       <w:proofErr w:type="spellStart"/>
       <w:r>
         <w:t>gitignore</w:t>
       </w:r>
       <w:proofErr w:type="spellEnd"/>
+      <w:proofErr w:type="gramEnd"/>
       <w:r>
         <w:t xml:space="preserve"> для исключения служебных файлов сборки Hugo. Изменения вносились небольшими логическими коммитами, что обеспечило прозрачную историю работы.</w:t>
       </w:r>
@@ -1076,7 +2031,11 @@
         <w:jc w:val="both"/>
       </w:pPr>
       <w:r>
-        <w:t>Для совместной работы в репозитории настроены правила защиты основной ветки (branch protection ruleset): прямой пуш в master разрешён только администратору репозитория, остальные участники вносят изменения исключительно через Pull Request. Это исключает случайные правки и гарантирует, что в основную ветку попадает только проверенный код.</w:t>
+        <w:t xml:space="preserve">Для совместной работы в репозитории настроены правила защиты основной ветки (branch protection ruleset): прямой пуш в master разрешён только администратору репозитория, остальные участники вносят изменения </w:t>
+      </w:r>
+      <w:r>
+        <w:lastRenderedPageBreak/>
+        <w:t>исключительно через Pull Request. Это исключает случайные правки и гарантирует, что в основную ветку попадает только проверенный код.</w:t>
       </w:r>
     </w:p>
     <w:p>
@@ -1085,11 +2044,7 @@
         <w:jc w:val="both"/>
       </w:pPr>
       <w:r>
-        <w:t xml:space="preserve">Принят следующий порядок: участник создаёт под задачу отдельную ветку (например, feat/site-design), фиксирует изменения коммитами и оформляет Pull Request в master. Администратор проводит код-ревью — </w:t>
-      </w:r>
-      <w:r>
-        <w:lastRenderedPageBreak/>
-        <w:t>просматривает изменения, при необходимости запрашивает доработку и только затем выполняет слияние. Это обеспечивает контроль качества и прозрачную историю проекта.</w:t>
+        <w:t>Принят следующий порядок: участник создаёт под задачу отдельную ветку (например, feat/site-design), фиксирует изменения коммитами и оформляет Pull Request в master. Администратор проводит код-ревью — просматривает изменения, при необходимости запрашивает доработку и только затем выполняет слияние. Это обеспечивает контроль качества и прозрачную историю проекта.</w:t>
       </w:r>
     </w:p>
     <w:p>
@@ -1097,6 +2052,7 @@
         <w:pStyle w:val="2"/>
         <w:spacing w:before="120" w:after="60"/>
       </w:pPr>
+      <w:bookmarkStart w:id="11" w:name="_Toc232273176"/>
       <w:r>
         <w:t xml:space="preserve">2. Документация в формате </w:t>
       </w:r>
@@ -1104,6 +2060,7 @@
       <w:r>
         <w:t>Markdown</w:t>
       </w:r>
+      <w:bookmarkEnd w:id="11"/>
       <w:proofErr w:type="spellEnd"/>
     </w:p>
     <w:p>
@@ -1136,9 +2093,11 @@
         <w:pStyle w:val="2"/>
         <w:spacing w:before="120" w:after="60"/>
       </w:pPr>
+      <w:bookmarkStart w:id="12" w:name="_Toc232273177"/>
       <w:r>
         <w:t>3. Создание статического веб-сайта на Hugo</w:t>
       </w:r>
+      <w:bookmarkEnd w:id="12"/>
     </w:p>
     <w:p>
       <w:pPr>
@@ -1178,23 +2137,7 @@
       </w:r>
       <w:proofErr w:type="spellEnd"/>
       <w:r>
-        <w:t xml:space="preserve">), шаблоны одиночных страниц и списков, а также фирменные стили CSS в светлом «маркетплейс»-стиле, подключённые через Hugo </w:t>
-      </w:r>
-      <w:proofErr w:type="spellStart"/>
-      <w:r>
-        <w:t>Pipes</w:t>
-      </w:r>
-      <w:proofErr w:type="spellEnd"/>
-      <w:r>
-        <w:t xml:space="preserve"> с </w:t>
-      </w:r>
-      <w:proofErr w:type="spellStart"/>
-      <w:r>
-        <w:t>минификацией</w:t>
-      </w:r>
-      <w:proofErr w:type="spellEnd"/>
-      <w:r>
-        <w:t>.</w:t>
+        <w:t>), шаблоны одиночных страниц и списков, а также фирменные стили CSS в светлом «маркетплейс»-стиле.</w:t>
       </w:r>
     </w:p>
     <w:p>
@@ -1268,6 +2211,7 @@
         <w:jc w:val="both"/>
       </w:pPr>
       <w:r>
+        <w:lastRenderedPageBreak/>
         <w:t>Ресурсы — ссылки на полезные материалы и источники по теме проекта.</w:t>
       </w:r>
     </w:p>
@@ -1285,11 +2229,7 @@
       </w:r>
       <w:proofErr w:type="spellEnd"/>
       <w:r>
-        <w:t xml:space="preserve">, логотипами университета и маркетплейса, а также </w:t>
-      </w:r>
-      <w:r>
-        <w:lastRenderedPageBreak/>
-        <w:t xml:space="preserve">собственными SVG-схемами (архитектура системы и пользовательский сценарий) и таблицами с экономическими показателями. Корректность сборки проверена командами </w:t>
+        <w:t xml:space="preserve">, логотипами университета и маркетплейса, а также собственными SVG-схемами (архитектура системы и пользовательский сценарий) и таблицами с экономическими показателями. Корректность сборки проверена командами </w:t>
       </w:r>
       <w:proofErr w:type="spellStart"/>
       <w:r>
@@ -1322,7 +2262,849 @@
         <w:jc w:val="both"/>
       </w:pPr>
       <w:r>
-        <w:t>Шаблоны устроены по принципу наследования: базовый каркас baseof.html задаёт общую структуру страницы и оставляет блок для содержимого, который доопределяют шаблоны single.html и list.html, благодаря чему разметка не дублируется. Для размещения собственных SVG-схем прямо в Markdown включён режим unsafe рендерера Goldmark.</w:t>
+        <w:t>Шаблоны устроены по принципу наследования: базовый каркас baseof.html задаёт общую структуру страницы и оставляет блок для содержимого, который доопределяют шаблоны single.html и list.html, благодаря чему разметка не дублируется.</w:t>
+      </w:r>
+    </w:p>
+    <w:p>
+      <w:pPr>
+        <w:ind w:firstLine="709"/>
+        <w:jc w:val="both"/>
+      </w:pPr>
+      <w:r>
+        <w:t>Ниже приведены ключевые фрагменты темы: каркас страницы (листинг 1) и основные настройки сайта с пунктами меню навигации в файле конфигурации hugo.toml (листинг 2).</w:t>
+      </w:r>
+    </w:p>
+    <w:p>
+      <w:pPr>
+        <w:pBdr>
+          <w:top w:val="single" w:sz="4" w:space="4" w:color="BFBFBF"/>
+          <w:left w:val="single" w:sz="4" w:space="4" w:color="BFBFBF"/>
+          <w:bottom w:val="single" w:sz="4" w:space="4" w:color="BFBFBF"/>
+          <w:right w:val="single" w:sz="4" w:space="4" w:color="BFBFBF"/>
+        </w:pBdr>
+        <w:shd w:val="clear" w:color="auto" w:fill="F5F5F5"/>
+        <w:spacing w:before="40" w:after="120" w:line="240" w:lineRule="auto"/>
+        <w:ind w:left="142" w:right="142"/>
+        <w:rPr>
+          <w:rFonts w:ascii="Courier New" w:hAnsi="Courier New" w:cs="Courier New"/>
+          <w:sz w:val="18"/>
+          <w:szCs w:val="18"/>
+          <w:lang w:val="en-US"/>
+        </w:rPr>
+      </w:pPr>
+      <w:r>
+        <w:rPr>
+          <w:rFonts w:ascii="Courier New" w:hAnsi="Courier New" w:cs="Courier New"/>
+          <w:sz w:val="18"/>
+          <w:szCs w:val="18"/>
+          <w:lang w:val="en-US"/>
+        </w:rPr>
+        <w:t>&lt;!DOCTYPE html&gt;</w:t>
+      </w:r>
+      <w:r>
+        <w:rPr>
+          <w:rFonts w:ascii="Courier New" w:hAnsi="Courier New" w:cs="Courier New"/>
+          <w:sz w:val="18"/>
+          <w:szCs w:val="18"/>
+          <w:lang w:val="en-US"/>
+        </w:rPr>
+        <w:br/>
+        <w:t>&lt;html lang="</w:t>
+      </w:r>
+      <w:proofErr w:type="spellStart"/>
+      <w:r>
+        <w:rPr>
+          <w:rFonts w:ascii="Courier New" w:hAnsi="Courier New" w:cs="Courier New"/>
+          <w:sz w:val="18"/>
+          <w:szCs w:val="18"/>
+          <w:lang w:val="en-US"/>
+        </w:rPr>
+        <w:t>ru</w:t>
+      </w:r>
+      <w:proofErr w:type="spellEnd"/>
+      <w:r>
+        <w:rPr>
+          <w:rFonts w:ascii="Courier New" w:hAnsi="Courier New" w:cs="Courier New"/>
+          <w:sz w:val="18"/>
+          <w:szCs w:val="18"/>
+          <w:lang w:val="en-US"/>
+        </w:rPr>
+        <w:t>"&gt;</w:t>
+      </w:r>
+      <w:r>
+        <w:rPr>
+          <w:rFonts w:ascii="Courier New" w:hAnsi="Courier New" w:cs="Courier New"/>
+          <w:sz w:val="18"/>
+          <w:szCs w:val="18"/>
+          <w:lang w:val="en-US"/>
+        </w:rPr>
+        <w:br/>
+        <w:t>&lt;head&gt;</w:t>
+      </w:r>
+      <w:r>
+        <w:rPr>
+          <w:rFonts w:ascii="Courier New" w:hAnsi="Courier New" w:cs="Courier New"/>
+          <w:sz w:val="18"/>
+          <w:szCs w:val="18"/>
+          <w:lang w:val="en-US"/>
+        </w:rPr>
+        <w:br/>
+        <w:t xml:space="preserve">  {</w:t>
+      </w:r>
+      <w:proofErr w:type="gramStart"/>
+      <w:r>
+        <w:rPr>
+          <w:rFonts w:ascii="Courier New" w:hAnsi="Courier New" w:cs="Courier New"/>
+          <w:sz w:val="18"/>
+          <w:szCs w:val="18"/>
+          <w:lang w:val="en-US"/>
+        </w:rPr>
+        <w:t>{ partial</w:t>
+      </w:r>
+      <w:proofErr w:type="gramEnd"/>
+      <w:r>
+        <w:rPr>
+          <w:rFonts w:ascii="Courier New" w:hAnsi="Courier New" w:cs="Courier New"/>
+          <w:sz w:val="18"/>
+          <w:szCs w:val="18"/>
+          <w:lang w:val="en-US"/>
+        </w:rPr>
+        <w:t xml:space="preserve"> "head.html" . }}</w:t>
+      </w:r>
+      <w:r>
+        <w:rPr>
+          <w:rFonts w:ascii="Courier New" w:hAnsi="Courier New" w:cs="Courier New"/>
+          <w:sz w:val="18"/>
+          <w:szCs w:val="18"/>
+          <w:lang w:val="en-US"/>
+        </w:rPr>
+        <w:br/>
+        <w:t>&lt;/head&gt;</w:t>
+      </w:r>
+      <w:r>
+        <w:rPr>
+          <w:rFonts w:ascii="Courier New" w:hAnsi="Courier New" w:cs="Courier New"/>
+          <w:sz w:val="18"/>
+          <w:szCs w:val="18"/>
+          <w:lang w:val="en-US"/>
+        </w:rPr>
+        <w:br/>
+        <w:t>&lt;body&gt;</w:t>
+      </w:r>
+      <w:r>
+        <w:rPr>
+          <w:rFonts w:ascii="Courier New" w:hAnsi="Courier New" w:cs="Courier New"/>
+          <w:sz w:val="18"/>
+          <w:szCs w:val="18"/>
+          <w:lang w:val="en-US"/>
+        </w:rPr>
+        <w:br/>
+        <w:t xml:space="preserve">  {</w:t>
+      </w:r>
+      <w:proofErr w:type="gramStart"/>
+      <w:r>
+        <w:rPr>
+          <w:rFonts w:ascii="Courier New" w:hAnsi="Courier New" w:cs="Courier New"/>
+          <w:sz w:val="18"/>
+          <w:szCs w:val="18"/>
+          <w:lang w:val="en-US"/>
+        </w:rPr>
+        <w:t>{ partial</w:t>
+      </w:r>
+      <w:proofErr w:type="gramEnd"/>
+      <w:r>
+        <w:rPr>
+          <w:rFonts w:ascii="Courier New" w:hAnsi="Courier New" w:cs="Courier New"/>
+          <w:sz w:val="18"/>
+          <w:szCs w:val="18"/>
+          <w:lang w:val="en-US"/>
+        </w:rPr>
+        <w:t xml:space="preserve"> "header.html" . }}</w:t>
+      </w:r>
+      <w:r>
+        <w:rPr>
+          <w:rFonts w:ascii="Courier New" w:hAnsi="Courier New" w:cs="Courier New"/>
+          <w:sz w:val="18"/>
+          <w:szCs w:val="18"/>
+          <w:lang w:val="en-US"/>
+        </w:rPr>
+        <w:br/>
+        <w:t xml:space="preserve">  &lt;main&gt;</w:t>
+      </w:r>
+      <w:r>
+        <w:rPr>
+          <w:rFonts w:ascii="Courier New" w:hAnsi="Courier New" w:cs="Courier New"/>
+          <w:sz w:val="18"/>
+          <w:szCs w:val="18"/>
+          <w:lang w:val="en-US"/>
+        </w:rPr>
+        <w:br/>
+        <w:t xml:space="preserve"> </w:t>
+      </w:r>
+      <w:proofErr w:type="gramStart"/>
+      <w:r>
+        <w:rPr>
+          <w:rFonts w:ascii="Courier New" w:hAnsi="Courier New" w:cs="Courier New"/>
+          <w:sz w:val="18"/>
+          <w:szCs w:val="18"/>
+          <w:lang w:val="en-US"/>
+        </w:rPr>
+        <w:t xml:space="preserve">   {</w:t>
+      </w:r>
+      <w:proofErr w:type="gramEnd"/>
+      <w:r>
+        <w:rPr>
+          <w:rFonts w:ascii="Courier New" w:hAnsi="Courier New" w:cs="Courier New"/>
+          <w:sz w:val="18"/>
+          <w:szCs w:val="18"/>
+          <w:lang w:val="en-US"/>
+        </w:rPr>
+        <w:t xml:space="preserve">{ block "main" . </w:t>
+      </w:r>
+      <w:proofErr w:type="gramStart"/>
+      <w:r>
+        <w:rPr>
+          <w:rFonts w:ascii="Courier New" w:hAnsi="Courier New" w:cs="Courier New"/>
+          <w:sz w:val="18"/>
+          <w:szCs w:val="18"/>
+          <w:lang w:val="en-US"/>
+        </w:rPr>
+        <w:t>}}{</w:t>
+      </w:r>
+      <w:proofErr w:type="gramEnd"/>
+      <w:r>
+        <w:rPr>
+          <w:rFonts w:ascii="Courier New" w:hAnsi="Courier New" w:cs="Courier New"/>
+          <w:sz w:val="18"/>
+          <w:szCs w:val="18"/>
+          <w:lang w:val="en-US"/>
+        </w:rPr>
+        <w:t>{ end }}</w:t>
+      </w:r>
+      <w:r>
+        <w:rPr>
+          <w:rFonts w:ascii="Courier New" w:hAnsi="Courier New" w:cs="Courier New"/>
+          <w:sz w:val="18"/>
+          <w:szCs w:val="18"/>
+          <w:lang w:val="en-US"/>
+        </w:rPr>
+        <w:br/>
+        <w:t xml:space="preserve">  &lt;/main&gt;</w:t>
+      </w:r>
+      <w:r>
+        <w:rPr>
+          <w:rFonts w:ascii="Courier New" w:hAnsi="Courier New" w:cs="Courier New"/>
+          <w:sz w:val="18"/>
+          <w:szCs w:val="18"/>
+          <w:lang w:val="en-US"/>
+        </w:rPr>
+        <w:br/>
+        <w:t xml:space="preserve">  {{ partial "footer.html" . }}</w:t>
+      </w:r>
+      <w:r>
+        <w:rPr>
+          <w:rFonts w:ascii="Courier New" w:hAnsi="Courier New" w:cs="Courier New"/>
+          <w:sz w:val="18"/>
+          <w:szCs w:val="18"/>
+          <w:lang w:val="en-US"/>
+        </w:rPr>
+        <w:br/>
+      </w:r>
+      <w:r>
+        <w:rPr>
+          <w:rFonts w:ascii="Courier New" w:hAnsi="Courier New" w:cs="Courier New"/>
+          <w:sz w:val="18"/>
+          <w:szCs w:val="18"/>
+          <w:lang w:val="en-US"/>
+        </w:rPr>
+        <w:t>&lt;/body&gt;</w:t>
+      </w:r>
+      <w:r>
+        <w:rPr>
+          <w:rFonts w:ascii="Courier New" w:hAnsi="Courier New" w:cs="Courier New"/>
+          <w:sz w:val="18"/>
+          <w:szCs w:val="18"/>
+          <w:lang w:val="en-US"/>
+        </w:rPr>
+        <w:br/>
+        <w:t>&lt;/html&gt;</w:t>
+      </w:r>
+    </w:p>
+    <w:p>
+      <w:pPr>
+        <w:spacing w:before="120" w:after="40"/>
+        <w:jc w:val="center"/>
+        <w:rPr>
+          <w:i/>
+          <w:iCs/>
+          <w:sz w:val="24"/>
+          <w:szCs w:val="24"/>
+          <w:lang w:val="en-US"/>
+        </w:rPr>
+      </w:pPr>
+      <w:r>
+        <w:rPr>
+          <w:i/>
+          <w:iCs/>
+          <w:sz w:val="24"/>
+          <w:szCs w:val="24"/>
+        </w:rPr>
+        <w:t>Листинг</w:t>
+      </w:r>
+      <w:r>
+        <w:rPr>
+          <w:i/>
+          <w:iCs/>
+          <w:sz w:val="24"/>
+          <w:szCs w:val="24"/>
+          <w:lang w:val="en-US"/>
+        </w:rPr>
+        <w:t xml:space="preserve"> 1 — </w:t>
+      </w:r>
+      <w:r>
+        <w:rPr>
+          <w:i/>
+          <w:iCs/>
+          <w:sz w:val="24"/>
+          <w:szCs w:val="24"/>
+        </w:rPr>
+        <w:t>Базовый</w:t>
+      </w:r>
+      <w:r>
+        <w:rPr>
+          <w:i/>
+          <w:iCs/>
+          <w:sz w:val="24"/>
+          <w:szCs w:val="24"/>
+          <w:lang w:val="en-US"/>
+        </w:rPr>
+        <w:t xml:space="preserve"> </w:t>
+      </w:r>
+      <w:r>
+        <w:rPr>
+          <w:i/>
+          <w:iCs/>
+          <w:sz w:val="24"/>
+          <w:szCs w:val="24"/>
+        </w:rPr>
+        <w:t>каркас</w:t>
+      </w:r>
+      <w:r>
+        <w:rPr>
+          <w:i/>
+          <w:iCs/>
+          <w:sz w:val="24"/>
+          <w:szCs w:val="24"/>
+          <w:lang w:val="en-US"/>
+        </w:rPr>
+        <w:t xml:space="preserve"> </w:t>
+      </w:r>
+      <w:r>
+        <w:rPr>
+          <w:i/>
+          <w:iCs/>
+          <w:sz w:val="24"/>
+          <w:szCs w:val="24"/>
+        </w:rPr>
+        <w:t>шаблона</w:t>
+      </w:r>
+      <w:r>
+        <w:rPr>
+          <w:i/>
+          <w:iCs/>
+          <w:sz w:val="24"/>
+          <w:szCs w:val="24"/>
+          <w:lang w:val="en-US"/>
+        </w:rPr>
+        <w:t xml:space="preserve"> (layouts/_default/baseof.html)</w:t>
+      </w:r>
+      <w:r>
+        <w:rPr>
+          <w:lang w:val="en-US"/>
+        </w:rPr>
+        <w:br w:type="page"/>
+      </w:r>
+    </w:p>
+    <w:p>
+      <w:pPr>
+        <w:pBdr>
+          <w:top w:val="single" w:sz="4" w:space="4" w:color="BFBFBF"/>
+          <w:left w:val="single" w:sz="4" w:space="4" w:color="BFBFBF"/>
+          <w:bottom w:val="single" w:sz="4" w:space="4" w:color="BFBFBF"/>
+          <w:right w:val="single" w:sz="4" w:space="4" w:color="BFBFBF"/>
+        </w:pBdr>
+        <w:shd w:val="clear" w:color="auto" w:fill="F5F5F5"/>
+        <w:spacing w:before="40" w:after="120" w:line="240" w:lineRule="auto"/>
+        <w:ind w:left="142" w:right="142"/>
+        <w:rPr>
+          <w:rFonts w:ascii="Courier New" w:hAnsi="Courier New" w:cs="Courier New"/>
+          <w:sz w:val="18"/>
+          <w:szCs w:val="18"/>
+          <w:lang w:val="en-US"/>
+        </w:rPr>
+      </w:pPr>
+      <w:proofErr w:type="spellStart"/>
+      <w:r>
+        <w:rPr>
+          <w:rFonts w:ascii="Courier New" w:hAnsi="Courier New" w:cs="Courier New"/>
+          <w:sz w:val="18"/>
+          <w:szCs w:val="18"/>
+          <w:lang w:val="en-US"/>
+        </w:rPr>
+        <w:lastRenderedPageBreak/>
+        <w:t>languageCode</w:t>
+      </w:r>
+      <w:proofErr w:type="spellEnd"/>
+      <w:r>
+        <w:rPr>
+          <w:rFonts w:ascii="Courier New" w:hAnsi="Courier New" w:cs="Courier New"/>
+          <w:sz w:val="18"/>
+          <w:szCs w:val="18"/>
+          <w:lang w:val="en-US"/>
+        </w:rPr>
+        <w:t xml:space="preserve"> = '</w:t>
+      </w:r>
+      <w:proofErr w:type="spellStart"/>
+      <w:r>
+        <w:rPr>
+          <w:rFonts w:ascii="Courier New" w:hAnsi="Courier New" w:cs="Courier New"/>
+          <w:sz w:val="18"/>
+          <w:szCs w:val="18"/>
+          <w:lang w:val="en-US"/>
+        </w:rPr>
+        <w:t>ru-ru</w:t>
+      </w:r>
+      <w:proofErr w:type="spellEnd"/>
+      <w:r>
+        <w:rPr>
+          <w:rFonts w:ascii="Courier New" w:hAnsi="Courier New" w:cs="Courier New"/>
+          <w:sz w:val="18"/>
+          <w:szCs w:val="18"/>
+          <w:lang w:val="en-US"/>
+        </w:rPr>
+        <w:t>'</w:t>
+      </w:r>
+      <w:r>
+        <w:rPr>
+          <w:rFonts w:ascii="Courier New" w:hAnsi="Courier New" w:cs="Courier New"/>
+          <w:sz w:val="18"/>
+          <w:szCs w:val="18"/>
+          <w:lang w:val="en-US"/>
+        </w:rPr>
+        <w:br/>
+        <w:t>title = '</w:t>
+      </w:r>
+      <w:proofErr w:type="spellStart"/>
+      <w:r>
+        <w:rPr>
+          <w:rFonts w:ascii="Courier New" w:hAnsi="Courier New" w:cs="Courier New"/>
+          <w:sz w:val="18"/>
+          <w:szCs w:val="18"/>
+        </w:rPr>
+        <w:t>КупиУмно</w:t>
+      </w:r>
+      <w:proofErr w:type="spellEnd"/>
+      <w:r>
+        <w:rPr>
+          <w:rFonts w:ascii="Courier New" w:hAnsi="Courier New" w:cs="Courier New"/>
+          <w:sz w:val="18"/>
+          <w:szCs w:val="18"/>
+          <w:lang w:val="en-US"/>
+        </w:rPr>
+        <w:t xml:space="preserve"> — </w:t>
+      </w:r>
+      <w:r>
+        <w:rPr>
+          <w:rFonts w:ascii="Courier New" w:hAnsi="Courier New" w:cs="Courier New"/>
+          <w:sz w:val="18"/>
+          <w:szCs w:val="18"/>
+        </w:rPr>
+        <w:t>агрегатор</w:t>
+      </w:r>
+      <w:r>
+        <w:rPr>
+          <w:rFonts w:ascii="Courier New" w:hAnsi="Courier New" w:cs="Courier New"/>
+          <w:sz w:val="18"/>
+          <w:szCs w:val="18"/>
+          <w:lang w:val="en-US"/>
+        </w:rPr>
+        <w:t xml:space="preserve"> </w:t>
+      </w:r>
+      <w:r>
+        <w:rPr>
+          <w:rFonts w:ascii="Courier New" w:hAnsi="Courier New" w:cs="Courier New"/>
+          <w:sz w:val="18"/>
+          <w:szCs w:val="18"/>
+        </w:rPr>
+        <w:t>лучших</w:t>
+      </w:r>
+      <w:r>
+        <w:rPr>
+          <w:rFonts w:ascii="Courier New" w:hAnsi="Courier New" w:cs="Courier New"/>
+          <w:sz w:val="18"/>
+          <w:szCs w:val="18"/>
+          <w:lang w:val="en-US"/>
+        </w:rPr>
+        <w:t xml:space="preserve"> </w:t>
+      </w:r>
+      <w:r>
+        <w:rPr>
+          <w:rFonts w:ascii="Courier New" w:hAnsi="Courier New" w:cs="Courier New"/>
+          <w:sz w:val="18"/>
+          <w:szCs w:val="18"/>
+        </w:rPr>
+        <w:t>предложений</w:t>
+      </w:r>
+      <w:r>
+        <w:rPr>
+          <w:rFonts w:ascii="Courier New" w:hAnsi="Courier New" w:cs="Courier New"/>
+          <w:sz w:val="18"/>
+          <w:szCs w:val="18"/>
+          <w:lang w:val="en-US"/>
+        </w:rPr>
+        <w:t>'</w:t>
+      </w:r>
+      <w:r>
+        <w:rPr>
+          <w:rFonts w:ascii="Courier New" w:hAnsi="Courier New" w:cs="Courier New"/>
+          <w:sz w:val="18"/>
+          <w:szCs w:val="18"/>
+          <w:lang w:val="en-US"/>
+        </w:rPr>
+        <w:br/>
+      </w:r>
+      <w:proofErr w:type="spellStart"/>
+      <w:r>
+        <w:rPr>
+          <w:rFonts w:ascii="Courier New" w:hAnsi="Courier New" w:cs="Courier New"/>
+          <w:sz w:val="18"/>
+          <w:szCs w:val="18"/>
+          <w:lang w:val="en-US"/>
+        </w:rPr>
+        <w:t>disableKinds</w:t>
+      </w:r>
+      <w:proofErr w:type="spellEnd"/>
+      <w:r>
+        <w:rPr>
+          <w:rFonts w:ascii="Courier New" w:hAnsi="Courier New" w:cs="Courier New"/>
+          <w:sz w:val="18"/>
+          <w:szCs w:val="18"/>
+          <w:lang w:val="en-US"/>
+        </w:rPr>
+        <w:t xml:space="preserve"> = ['taxonomy', 'term']</w:t>
+      </w:r>
+    </w:p>
+    <w:p>
+      <w:pPr>
+        <w:pBdr>
+          <w:top w:val="single" w:sz="4" w:space="4" w:color="BFBFBF"/>
+          <w:left w:val="single" w:sz="4" w:space="4" w:color="BFBFBF"/>
+          <w:bottom w:val="single" w:sz="4" w:space="4" w:color="BFBFBF"/>
+          <w:right w:val="single" w:sz="4" w:space="4" w:color="BFBFBF"/>
+        </w:pBdr>
+        <w:shd w:val="clear" w:color="auto" w:fill="F5F5F5"/>
+        <w:spacing w:before="40" w:after="120" w:line="240" w:lineRule="auto"/>
+        <w:ind w:left="142" w:right="142"/>
+        <w:rPr>
+          <w:rFonts w:ascii="Courier New" w:hAnsi="Courier New" w:cs="Courier New"/>
+          <w:sz w:val="18"/>
+          <w:szCs w:val="18"/>
+        </w:rPr>
+      </w:pPr>
+      <w:r>
+        <w:rPr>
+          <w:rFonts w:ascii="Courier New" w:hAnsi="Courier New" w:cs="Courier New"/>
+          <w:sz w:val="18"/>
+          <w:szCs w:val="18"/>
+          <w:lang w:val="en-US"/>
+        </w:rPr>
+        <w:br/>
+      </w:r>
+      <w:r>
+        <w:rPr>
+          <w:rFonts w:ascii="Courier New" w:hAnsi="Courier New" w:cs="Courier New"/>
+          <w:sz w:val="18"/>
+          <w:szCs w:val="18"/>
+        </w:rPr>
+        <w:t>[</w:t>
+      </w:r>
+      <w:proofErr w:type="spellStart"/>
+      <w:r>
+        <w:rPr>
+          <w:rFonts w:ascii="Courier New" w:hAnsi="Courier New" w:cs="Courier New"/>
+          <w:sz w:val="18"/>
+          <w:szCs w:val="18"/>
+        </w:rPr>
+        <w:t>params</w:t>
+      </w:r>
+      <w:proofErr w:type="spellEnd"/>
+      <w:r>
+        <w:rPr>
+          <w:rFonts w:ascii="Courier New" w:hAnsi="Courier New" w:cs="Courier New"/>
+          <w:sz w:val="18"/>
+          <w:szCs w:val="18"/>
+        </w:rPr>
+        <w:t>]</w:t>
+      </w:r>
+      <w:r>
+        <w:rPr>
+          <w:rFonts w:ascii="Courier New" w:hAnsi="Courier New" w:cs="Courier New"/>
+          <w:sz w:val="18"/>
+          <w:szCs w:val="18"/>
+        </w:rPr>
+        <w:br/>
+        <w:t xml:space="preserve">  </w:t>
+      </w:r>
+      <w:proofErr w:type="spellStart"/>
+      <w:r>
+        <w:rPr>
+          <w:rFonts w:ascii="Courier New" w:hAnsi="Courier New" w:cs="Courier New"/>
+          <w:sz w:val="18"/>
+          <w:szCs w:val="18"/>
+        </w:rPr>
+        <w:t>tagline</w:t>
+      </w:r>
+      <w:proofErr w:type="spellEnd"/>
+      <w:r>
+        <w:rPr>
+          <w:rFonts w:ascii="Courier New" w:hAnsi="Courier New" w:cs="Courier New"/>
+          <w:sz w:val="18"/>
+          <w:szCs w:val="18"/>
+        </w:rPr>
+        <w:t xml:space="preserve"> = 'Покупай умно, не переплачивай'</w:t>
+      </w:r>
+      <w:r>
+        <w:rPr>
+          <w:rFonts w:ascii="Courier New" w:hAnsi="Courier New" w:cs="Courier New"/>
+          <w:sz w:val="18"/>
+          <w:szCs w:val="18"/>
+        </w:rPr>
+        <w:br/>
+        <w:t xml:space="preserve">  </w:t>
+      </w:r>
+      <w:proofErr w:type="spellStart"/>
+      <w:r>
+        <w:rPr>
+          <w:rFonts w:ascii="Courier New" w:hAnsi="Courier New" w:cs="Courier New"/>
+          <w:sz w:val="18"/>
+          <w:szCs w:val="18"/>
+        </w:rPr>
+        <w:t>email</w:t>
+      </w:r>
+      <w:proofErr w:type="spellEnd"/>
+      <w:r>
+        <w:rPr>
+          <w:rFonts w:ascii="Courier New" w:hAnsi="Courier New" w:cs="Courier New"/>
+          <w:sz w:val="18"/>
+          <w:szCs w:val="18"/>
+        </w:rPr>
+        <w:t xml:space="preserve"> = 'umid1504@gmail.com'</w:t>
+      </w:r>
+    </w:p>
+    <w:p>
+      <w:pPr>
+        <w:pBdr>
+          <w:top w:val="single" w:sz="4" w:space="4" w:color="BFBFBF"/>
+          <w:left w:val="single" w:sz="4" w:space="4" w:color="BFBFBF"/>
+          <w:bottom w:val="single" w:sz="4" w:space="4" w:color="BFBFBF"/>
+          <w:right w:val="single" w:sz="4" w:space="4" w:color="BFBFBF"/>
+        </w:pBdr>
+        <w:shd w:val="clear" w:color="auto" w:fill="F5F5F5"/>
+        <w:spacing w:before="40" w:after="120" w:line="240" w:lineRule="auto"/>
+        <w:ind w:left="142" w:right="142"/>
+        <w:rPr>
+          <w:rFonts w:ascii="Courier New" w:hAnsi="Courier New" w:cs="Courier New"/>
+          <w:sz w:val="18"/>
+          <w:szCs w:val="18"/>
+        </w:rPr>
+      </w:pPr>
+      <w:r>
+        <w:rPr>
+          <w:rFonts w:ascii="Courier New" w:hAnsi="Courier New" w:cs="Courier New"/>
+          <w:sz w:val="18"/>
+          <w:szCs w:val="18"/>
+        </w:rPr>
+        <w:br/>
+        <w:t># Пункты верхнего меню — разделы сайта:</w:t>
+      </w:r>
+      <w:r>
+        <w:rPr>
+          <w:rFonts w:ascii="Courier New" w:hAnsi="Courier New" w:cs="Courier New"/>
+          <w:sz w:val="18"/>
+          <w:szCs w:val="18"/>
+        </w:rPr>
+        <w:br/>
+        <w:t>[[</w:t>
+      </w:r>
+      <w:proofErr w:type="gramStart"/>
+      <w:r>
+        <w:rPr>
+          <w:rFonts w:ascii="Courier New" w:hAnsi="Courier New" w:cs="Courier New"/>
+          <w:sz w:val="18"/>
+          <w:szCs w:val="18"/>
+        </w:rPr>
+        <w:t>menu.main</w:t>
+      </w:r>
+      <w:proofErr w:type="gramEnd"/>
+      <w:r>
+        <w:rPr>
+          <w:rFonts w:ascii="Courier New" w:hAnsi="Courier New" w:cs="Courier New"/>
+          <w:sz w:val="18"/>
+          <w:szCs w:val="18"/>
+        </w:rPr>
+        <w:t>]]</w:t>
+      </w:r>
+      <w:r>
+        <w:rPr>
+          <w:rFonts w:ascii="Courier New" w:hAnsi="Courier New" w:cs="Courier New"/>
+          <w:sz w:val="18"/>
+          <w:szCs w:val="18"/>
+        </w:rPr>
+        <w:br/>
+        <w:t xml:space="preserve">  name = 'Главная'</w:t>
+      </w:r>
+      <w:r>
+        <w:rPr>
+          <w:rFonts w:ascii="Courier New" w:hAnsi="Courier New" w:cs="Courier New"/>
+          <w:sz w:val="18"/>
+          <w:szCs w:val="18"/>
+        </w:rPr>
+        <w:br/>
+        <w:t xml:space="preserve">  pageRef = '/'</w:t>
+      </w:r>
+      <w:r>
+        <w:rPr>
+          <w:rFonts w:ascii="Courier New" w:hAnsi="Courier New" w:cs="Courier New"/>
+          <w:sz w:val="18"/>
+          <w:szCs w:val="18"/>
+        </w:rPr>
+        <w:br/>
+        <w:t xml:space="preserve">  weight = 1</w:t>
+      </w:r>
+      <w:r>
+        <w:rPr>
+          <w:rFonts w:ascii="Courier New" w:hAnsi="Courier New" w:cs="Courier New"/>
+          <w:sz w:val="18"/>
+          <w:szCs w:val="18"/>
+        </w:rPr>
+        <w:br/>
+        <w:t>[[menu.main]]</w:t>
+      </w:r>
+      <w:r>
+        <w:rPr>
+          <w:rFonts w:ascii="Courier New" w:hAnsi="Courier New" w:cs="Courier New"/>
+          <w:sz w:val="18"/>
+          <w:szCs w:val="18"/>
+        </w:rPr>
+        <w:br/>
+        <w:t xml:space="preserve">  name = 'О проекте'</w:t>
+      </w:r>
+      <w:r>
+        <w:rPr>
+          <w:rFonts w:ascii="Courier New" w:hAnsi="Courier New" w:cs="Courier New"/>
+          <w:sz w:val="18"/>
+          <w:szCs w:val="18"/>
+        </w:rPr>
+        <w:br/>
+        <w:t xml:space="preserve">  pageRef = '/about'</w:t>
+      </w:r>
+      <w:r>
+        <w:rPr>
+          <w:rFonts w:ascii="Courier New" w:hAnsi="Courier New" w:cs="Courier New"/>
+          <w:sz w:val="18"/>
+          <w:szCs w:val="18"/>
+        </w:rPr>
+        <w:br/>
+        <w:t xml:space="preserve">  weight = 2</w:t>
+      </w:r>
+      <w:r>
+        <w:rPr>
+          <w:rFonts w:ascii="Courier New" w:hAnsi="Courier New" w:cs="Courier New"/>
+          <w:sz w:val="18"/>
+          <w:szCs w:val="18"/>
+        </w:rPr>
+        <w:br/>
+        <w:t>[[menu.main]]</w:t>
+      </w:r>
+      <w:r>
+        <w:rPr>
+          <w:rFonts w:ascii="Courier New" w:hAnsi="Courier New" w:cs="Courier New"/>
+          <w:sz w:val="18"/>
+          <w:szCs w:val="18"/>
+        </w:rPr>
+        <w:br/>
+        <w:t xml:space="preserve">  name = 'Участники'</w:t>
+      </w:r>
+      <w:r>
+        <w:rPr>
+          <w:rFonts w:ascii="Courier New" w:hAnsi="Courier New" w:cs="Courier New"/>
+          <w:sz w:val="18"/>
+          <w:szCs w:val="18"/>
+        </w:rPr>
+        <w:br/>
+        <w:t xml:space="preserve">  pageRef = '/team'</w:t>
+      </w:r>
+      <w:r>
+        <w:rPr>
+          <w:rFonts w:ascii="Courier New" w:hAnsi="Courier New" w:cs="Courier New"/>
+          <w:sz w:val="18"/>
+          <w:szCs w:val="18"/>
+        </w:rPr>
+        <w:br/>
+        <w:t xml:space="preserve">  weight = 3</w:t>
+      </w:r>
+      <w:r>
+        <w:rPr>
+          <w:rFonts w:ascii="Courier New" w:hAnsi="Courier New" w:cs="Courier New"/>
+          <w:sz w:val="18"/>
+          <w:szCs w:val="18"/>
+        </w:rPr>
+        <w:br/>
+        <w:t># ... далее аналогично: Журнал, Ресурсы</w:t>
+      </w:r>
+    </w:p>
+    <w:p>
+      <w:pPr>
+        <w:spacing w:before="120" w:after="40"/>
+        <w:jc w:val="center"/>
+        <w:rPr>
+          <w:i/>
+          <w:iCs/>
+          <w:sz w:val="24"/>
+          <w:szCs w:val="24"/>
+        </w:rPr>
+      </w:pPr>
+      <w:bookmarkStart w:id="13" w:name="_Toc232273178"/>
+      <w:r>
+        <w:rPr>
+          <w:i/>
+          <w:iCs/>
+          <w:sz w:val="24"/>
+          <w:szCs w:val="24"/>
+        </w:rPr>
+        <w:t>Листинг 2 — Конфигурация сайта и меню навигации (</w:t>
+      </w:r>
+      <w:proofErr w:type="spellStart"/>
+      <w:proofErr w:type="gramStart"/>
+      <w:r>
+        <w:rPr>
+          <w:i/>
+          <w:iCs/>
+          <w:sz w:val="24"/>
+          <w:szCs w:val="24"/>
+        </w:rPr>
+        <w:t>hugo.toml</w:t>
+      </w:r>
+      <w:proofErr w:type="spellEnd"/>
+      <w:proofErr w:type="gramEnd"/>
+      <w:r>
+        <w:rPr>
+          <w:i/>
+          <w:iCs/>
+          <w:sz w:val="24"/>
+          <w:szCs w:val="24"/>
+        </w:rPr>
+        <w:t>)</w:t>
       </w:r>
     </w:p>
     <w:p>
@@ -1333,6 +3115,7 @@
       <w:r>
         <w:t>4. Подготовка отчёта по практике</w:t>
       </w:r>
+      <w:bookmarkEnd w:id="13"/>
     </w:p>
     <w:p>
       <w:pPr>
@@ -1357,9 +3140,11 @@
         <w:spacing w:before="240" w:after="120"/>
         <w:jc w:val="center"/>
       </w:pPr>
+      <w:bookmarkStart w:id="14" w:name="_Toc232273179"/>
       <w:r>
         <w:t>ЗАКЛЮЧЕНИЕ</w:t>
       </w:r>
+      <w:bookmarkEnd w:id="14"/>
     </w:p>
     <w:p>
       <w:pPr>
@@ -1367,64 +3152,7 @@
         <w:jc w:val="both"/>
       </w:pPr>
       <w:r>
-        <w:t xml:space="preserve">В ходе учебной (проектной) практики были выполнены все задачи базовой части задания (пункты 1, 2, 3 и 5). Создан и настроен репозиторий на </w:t>
-      </w:r>
-      <w:proofErr w:type="spellStart"/>
-      <w:r>
-        <w:t>GitHub</w:t>
-      </w:r>
-      <w:proofErr w:type="spellEnd"/>
-      <w:r>
-        <w:t xml:space="preserve">, освоены базовые приёмы работы с системой контроля версий </w:t>
-      </w:r>
-      <w:proofErr w:type="spellStart"/>
-      <w:r>
-        <w:t>Git</w:t>
-      </w:r>
-      <w:proofErr w:type="spellEnd"/>
-      <w:r>
-        <w:t xml:space="preserve">, подготовлена техническая документация в формате </w:t>
-      </w:r>
-      <w:proofErr w:type="spellStart"/>
-      <w:r>
-        <w:t>Markdown</w:t>
-      </w:r>
-      <w:proofErr w:type="spellEnd"/>
-      <w:r>
-        <w:t xml:space="preserve"> и разработан статический веб-сайт проекта «</w:t>
-      </w:r>
-      <w:proofErr w:type="spellStart"/>
-      <w:r>
-        <w:t>КупиУмно</w:t>
-      </w:r>
-      <w:proofErr w:type="spellEnd"/>
-      <w:r>
-        <w:t>» с уникальным оформлением и обязательными разделами.</w:t>
-      </w:r>
-    </w:p>
-    <w:p>
-      <w:pPr>
-        <w:ind w:firstLine="709"/>
-        <w:jc w:val="both"/>
-      </w:pPr>
-      <w:r>
-        <w:t xml:space="preserve">Результаты практики имеют практическую ценность: репозиторий и сайт наглядно представляют проект, а полученные навыки работы с </w:t>
-      </w:r>
-      <w:proofErr w:type="spellStart"/>
-      <w:r>
-        <w:t>Git</w:t>
-      </w:r>
-      <w:proofErr w:type="spellEnd"/>
-      <w:r>
-        <w:t xml:space="preserve">, </w:t>
-      </w:r>
-      <w:proofErr w:type="spellStart"/>
-      <w:r>
-        <w:t>Markdown</w:t>
-      </w:r>
-      <w:proofErr w:type="spellEnd"/>
-      <w:r>
-        <w:t xml:space="preserve"> и Hugo применимы в дальнейшей учебной и профессиональной деятельности. Поставленные цели практики достигнуты.</w:t>
+        <w:t>В ходе учебной (проектной) практики выполнены все задачи базовой части задания (пункты 1, 2, 3 и 5): настроен репозиторий на GitHub и освоены приёмы работы с Git, подготовлена документация в формате Markdown и разработан статический веб-сайт проекта «КупиУмно» с уникальным оформлением и обязательными разделами. Полученные навыки применимы в дальнейшей учебной и профессиональной деятельности; поставленные цели практики достигнуты.</w:t>
       </w:r>
     </w:p>
     <w:p>
@@ -1433,9 +3161,11 @@
         <w:spacing w:before="240" w:after="120"/>
         <w:jc w:val="center"/>
       </w:pPr>
+      <w:bookmarkStart w:id="15" w:name="_Toc232273180"/>
       <w:r>
         <w:t>СПИСОК ИСПОЛЬЗОВАННОЙ ЛИТЕРАТУРЫ</w:t>
       </w:r>
+      <w:bookmarkEnd w:id="15"/>
     </w:p>
     <w:p>
       <w:pPr>
@@ -1452,7 +3182,21 @@
         <w:rPr>
           <w:lang w:val="en-US"/>
         </w:rPr>
-        <w:t xml:space="preserve">Hugo: The world’s fastest framework for building websites : </w:t>
+        <w:t xml:space="preserve">Hugo: The world’s fastest framework for building </w:t>
+      </w:r>
+      <w:proofErr w:type="gramStart"/>
+      <w:r>
+        <w:rPr>
+          <w:lang w:val="en-US"/>
+        </w:rPr>
+        <w:t>websites :</w:t>
+      </w:r>
+      <w:proofErr w:type="gramEnd"/>
+      <w:r>
+        <w:rPr>
+          <w:lang w:val="en-US"/>
+        </w:rPr>
+        <w:t xml:space="preserve"> </w:t>
       </w:r>
       <w:r>
         <w:t>официальная</w:t>
@@ -1562,7 +3306,15 @@
       </w:r>
       <w:proofErr w:type="spellEnd"/>
       <w:r>
-        <w:t xml:space="preserve"> Guide : справочник по синтаксису. — URL: https://www.markdownguide.org/ (дата обращения: 08.06.2026).</w:t>
+        <w:t xml:space="preserve"> </w:t>
+      </w:r>
+      <w:proofErr w:type="gramStart"/>
+      <w:r>
+        <w:t>Guide :</w:t>
+      </w:r>
+      <w:proofErr w:type="gramEnd"/>
+      <w:r>
+        <w:t xml:space="preserve"> справочник по синтаксису. — URL: https://www.markdownguide.org/ (дата обращения: 08.06.2026).</w:t>
       </w:r>
     </w:p>
     <w:p>
@@ -1577,12 +3329,17 @@
         <w:t xml:space="preserve">MDN Web </w:t>
       </w:r>
       <w:proofErr w:type="spellStart"/>
+      <w:proofErr w:type="gramStart"/>
       <w:r>
         <w:t>Docs</w:t>
       </w:r>
       <w:proofErr w:type="spellEnd"/>
       <w:r>
-        <w:t xml:space="preserve"> : основы HTML и CSS. — URL: https://developer.mozilla.org/ru/ (дата обращения: 08.06.2026).</w:t>
+        <w:t xml:space="preserve"> :</w:t>
+      </w:r>
+      <w:proofErr w:type="gramEnd"/>
+      <w:r>
+        <w:t xml:space="preserve"> основы HTML и CSS. — URL: https://developer.mozilla.org/ru/ (дата обращения: 08.06.2026).</w:t>
       </w:r>
     </w:p>
     <w:p>
@@ -1602,7 +3359,15 @@
       </w:r>
       <w:proofErr w:type="spellEnd"/>
       <w:r>
-        <w:t xml:space="preserve"> в России : отчёты / Data Insight. — URL: https://datainsight.ru/ (дата обращения: 08.06.2026).</w:t>
+        <w:t xml:space="preserve"> в </w:t>
+      </w:r>
+      <w:proofErr w:type="gramStart"/>
+      <w:r>
+        <w:t>России :</w:t>
+      </w:r>
+      <w:proofErr w:type="gramEnd"/>
+      <w:r>
+        <w:t xml:space="preserve"> отчёты / Data Insight. — URL: https://datainsight.ru/ (дата обращения: 08.06.2026).</w:t>
       </w:r>
     </w:p>
     <w:p>
@@ -1611,9 +3376,11 @@
         <w:spacing w:before="240" w:after="120"/>
         <w:jc w:val="center"/>
       </w:pPr>
+      <w:bookmarkStart w:id="16" w:name="_Toc232273181"/>
       <w:r>
         <w:t>ПРИЛОЖЕНИЯ</w:t>
       </w:r>
+      <w:bookmarkEnd w:id="16"/>
     </w:p>
     <w:p>
       <w:pPr>
@@ -1670,7 +3437,15 @@
       </w:r>
       <w:proofErr w:type="spellEnd"/>
       <w:r>
-        <w:t xml:space="preserve">» (разделы: Главная, О проекте, Участники, Журнал, Ресурсы) — каталог </w:t>
+        <w:t>» (разделы: Главная</w:t>
+      </w:r>
+      <w:proofErr w:type="gramStart"/>
+      <w:r>
+        <w:t>, О</w:t>
+      </w:r>
+      <w:proofErr w:type="gramEnd"/>
+      <w:r>
+        <w:t xml:space="preserve"> проекте, Участники, Журнал, Ресурсы) — каталог </w:t>
       </w:r>
       <w:proofErr w:type="spellStart"/>
       <w:r>
@@ -1681,13 +3456,338 @@
         <w:t xml:space="preserve"> репозитория.</w:t>
       </w:r>
     </w:p>
+    <w:p>
+      <w:r>
+        <w:br w:type="page"/>
+      </w:r>
+    </w:p>
+    <w:p>
+      <w:pPr>
+        <w:ind w:firstLine="709"/>
+        <w:jc w:val="both"/>
+      </w:pPr>
+      <w:r>
+        <w:lastRenderedPageBreak/>
+        <w:t>Приложение В. Скриншоты сайта проекта.</w:t>
+      </w:r>
+    </w:p>
+    <w:p>
+      <w:pPr>
+        <w:keepNext/>
+        <w:spacing w:before="120" w:after="40"/>
+        <w:jc w:val="center"/>
+      </w:pPr>
+      <w:r>
+        <w:rPr>
+          <w:noProof/>
+        </w:rPr>
+        <w:drawing>
+          <wp:inline distT="0" distB="0" distL="0" distR="0" wp14:anchorId="78897060" wp14:editId="2F055AE5">
+            <wp:extent cx="5940425" cy="3736975"/>
+            <wp:effectExtent l="0" t="0" r="0" b="0"/>
+            <wp:docPr id="1" name="Рисунок 1"/>
+            <wp:cNvGraphicFramePr>
+              <a:graphicFrameLocks xmlns:a="http://schemas.openxmlformats.org/drawingml/2006/main" noChangeAspect="1"/>
+            </wp:cNvGraphicFramePr>
+            <a:graphic xmlns:a="http://schemas.openxmlformats.org/drawingml/2006/main">
+              <a:graphicData uri="http://schemas.openxmlformats.org/drawingml/2006/picture">
+                <pic:pic xmlns:pic="http://schemas.openxmlformats.org/drawingml/2006/picture">
+                  <pic:nvPicPr>
+                    <pic:cNvPr id="1" name=""/>
+                    <pic:cNvPicPr/>
+                  </pic:nvPicPr>
+                  <pic:blipFill>
+                    <a:blip r:embed="rId8"/>
+                    <a:stretch>
+                      <a:fillRect/>
+                    </a:stretch>
+                  </pic:blipFill>
+                  <pic:spPr>
+                    <a:xfrm>
+                      <a:off x="0" y="0"/>
+                      <a:ext cx="5940425" cy="3736975"/>
+                    </a:xfrm>
+                    <a:prstGeom prst="rect">
+                      <a:avLst/>
+                    </a:prstGeom>
+                  </pic:spPr>
+                </pic:pic>
+              </a:graphicData>
+            </a:graphic>
+          </wp:inline>
+        </w:drawing>
+      </w:r>
+    </w:p>
+    <w:p>
+      <w:pPr>
+        <w:pStyle w:val="a5"/>
+        <w:jc w:val="center"/>
+        <w:rPr>
+          <w:sz w:val="24"/>
+          <w:szCs w:val="24"/>
+        </w:rPr>
+      </w:pPr>
+      <w:r>
+        <w:rPr>
+          <w:sz w:val="24"/>
+          <w:szCs w:val="24"/>
+        </w:rPr>
+        <w:t xml:space="preserve">Рисунок </w:t>
+      </w:r>
+      <w:r>
+        <w:rPr>
+          <w:sz w:val="24"/>
+          <w:szCs w:val="24"/>
+        </w:rPr>
+        <w:fldChar w:fldCharType="begin"/>
+      </w:r>
+      <w:r>
+        <w:rPr>
+          <w:sz w:val="24"/>
+          <w:szCs w:val="24"/>
+        </w:rPr>
+        <w:instrText xml:space="preserve"> SEQ Рисунок \* ARABIC </w:instrText>
+      </w:r>
+      <w:r>
+        <w:rPr>
+          <w:sz w:val="24"/>
+          <w:szCs w:val="24"/>
+        </w:rPr>
+        <w:fldChar w:fldCharType="separate"/>
+      </w:r>
+      <w:r>
+        <w:rPr>
+          <w:noProof/>
+          <w:sz w:val="24"/>
+          <w:szCs w:val="24"/>
+        </w:rPr>
+        <w:t>1</w:t>
+      </w:r>
+      <w:r>
+        <w:rPr>
+          <w:sz w:val="24"/>
+          <w:szCs w:val="24"/>
+        </w:rPr>
+        <w:fldChar w:fldCharType="end"/>
+      </w:r>
+      <w:r>
+        <w:rPr>
+          <w:sz w:val="24"/>
+          <w:szCs w:val="24"/>
+        </w:rPr>
+        <w:t xml:space="preserve"> — Главная страница сайта</w:t>
+      </w:r>
+    </w:p>
+    <w:p>
+      <w:pPr>
+        <w:keepNext/>
+        <w:spacing w:after="160"/>
+        <w:jc w:val="center"/>
+      </w:pPr>
+      <w:r>
+        <w:rPr>
+          <w:noProof/>
+        </w:rPr>
+        <w:drawing>
+          <wp:inline distT="0" distB="0" distL="0" distR="0" wp14:anchorId="195FC7F6" wp14:editId="68DC81D8">
+            <wp:extent cx="5940425" cy="3498850"/>
+            <wp:effectExtent l="0" t="0" r="0" b="0"/>
+            <wp:docPr id="4" name="Рисунок 4"/>
+            <wp:cNvGraphicFramePr>
+              <a:graphicFrameLocks xmlns:a="http://schemas.openxmlformats.org/drawingml/2006/main" noChangeAspect="1"/>
+            </wp:cNvGraphicFramePr>
+            <a:graphic xmlns:a="http://schemas.openxmlformats.org/drawingml/2006/main">
+              <a:graphicData uri="http://schemas.openxmlformats.org/drawingml/2006/picture">
+                <pic:pic xmlns:pic="http://schemas.openxmlformats.org/drawingml/2006/picture">
+                  <pic:nvPicPr>
+                    <pic:cNvPr id="1" name=""/>
+                    <pic:cNvPicPr/>
+                  </pic:nvPicPr>
+                  <pic:blipFill>
+                    <a:blip r:embed="rId9"/>
+                    <a:stretch>
+                      <a:fillRect/>
+                    </a:stretch>
+                  </pic:blipFill>
+                  <pic:spPr>
+                    <a:xfrm>
+                      <a:off x="0" y="0"/>
+                      <a:ext cx="5940425" cy="3498850"/>
+                    </a:xfrm>
+                    <a:prstGeom prst="rect">
+                      <a:avLst/>
+                    </a:prstGeom>
+                  </pic:spPr>
+                </pic:pic>
+              </a:graphicData>
+            </a:graphic>
+          </wp:inline>
+        </w:drawing>
+      </w:r>
+    </w:p>
+    <w:p>
+      <w:pPr>
+        <w:pStyle w:val="a5"/>
+        <w:jc w:val="center"/>
+        <w:rPr>
+          <w:sz w:val="24"/>
+          <w:szCs w:val="24"/>
+        </w:rPr>
+      </w:pPr>
+      <w:r>
+        <w:rPr>
+          <w:sz w:val="24"/>
+          <w:szCs w:val="24"/>
+        </w:rPr>
+        <w:t xml:space="preserve">Рисунок </w:t>
+      </w:r>
+      <w:r>
+        <w:rPr>
+          <w:sz w:val="24"/>
+          <w:szCs w:val="24"/>
+        </w:rPr>
+        <w:fldChar w:fldCharType="begin"/>
+      </w:r>
+      <w:r>
+        <w:rPr>
+          <w:sz w:val="24"/>
+          <w:szCs w:val="24"/>
+        </w:rPr>
+        <w:instrText xml:space="preserve"> SEQ Рисунок \* ARABIC </w:instrText>
+      </w:r>
+      <w:r>
+        <w:rPr>
+          <w:sz w:val="24"/>
+          <w:szCs w:val="24"/>
+        </w:rPr>
+        <w:fldChar w:fldCharType="separate"/>
+      </w:r>
+      <w:r>
+        <w:rPr>
+          <w:noProof/>
+          <w:sz w:val="24"/>
+          <w:szCs w:val="24"/>
+        </w:rPr>
+        <w:t>2</w:t>
+      </w:r>
+      <w:r>
+        <w:rPr>
+          <w:sz w:val="24"/>
+          <w:szCs w:val="24"/>
+        </w:rPr>
+        <w:fldChar w:fldCharType="end"/>
+      </w:r>
+      <w:r>
+        <w:rPr>
+          <w:sz w:val="24"/>
+          <w:szCs w:val="24"/>
+        </w:rPr>
+        <w:t xml:space="preserve"> — Страница "О проекте", разделы "Архитектура системы" и "Основной функционал"</w:t>
+      </w:r>
+    </w:p>
     <w:sectPr>
+      <w:footerReference w:type="default" r:id="rId10"/>
       <w:pgSz w:w="11906" w:h="16838"/>
       <w:pgMar w:top="1134" w:right="850" w:bottom="1134" w:left="1701" w:header="708" w:footer="708" w:gutter="0"/>
       <w:cols w:space="720"/>
+      <w:titlePg/>
+      <w:docGrid w:linePitch="381"/>
     </w:sectPr>
   </w:body>
 </w:document>
+</file>
+
+<file path=word/endnotes.xml><?xml version="1.0" encoding="utf-8"?>
+<w:endnotes xmlns:wpc="http://schemas.microsoft.com/office/word/2010/wordprocessingCanvas" xmlns:cx="http://schemas.microsoft.com/office/drawing/2014/chartex" xmlns:cx1="http://schemas.microsoft.com/office/drawing/2015/9/8/chartex" xmlns:cx2="http://schemas.microsoft.com/office/drawing/2015/10/21/chartex" xmlns:cx3="http://schemas.microsoft.com/office/drawing/2016/5/9/chartex" xmlns:cx4="http://schemas.microsoft.com/office/drawing/2016/5/10/chartex" xmlns:cx5="http://schemas.microsoft.com/office/drawing/2016/5/11/chartex" xmlns:cx6="http://schemas.microsoft.com/office/drawing/2016/5/12/chartex" xmlns:cx7="http://schemas.microsoft.com/office/drawing/2016/5/13/chartex" xmlns:cx8="http://schemas.microsoft.com/office/drawing/2016/5/14/chartex" xmlns:mc="http://schemas.openxmlformats.org/markup-compatibility/2006" xmlns:aink="http://schemas.microsoft.com/office/drawing/2016/ink" xmlns:am3d="http://schemas.microsoft.com/office/drawing/2017/model3d" xmlns:o="urn:schemas-microsoft-com:office:office" xmlns:r="http://schemas.openxmlformats.org/officeDocument/2006/relationships" xmlns:m="http://schemas.openxmlformats.org/officeDocument/2006/math" xmlns:v="urn:schemas-microsoft-com:vml" xmlns:wp14="http://schemas.microsoft.com/office/word/2010/wordprocessingDrawing" xmlns:wp="http://schemas.openxmlformats.org/drawingml/2006/wordprocessingDrawing" xmlns:w10="urn:schemas-microsoft-com:office:word" xmlns:w="http://schemas.openxmlformats.org/wordprocessingml/2006/main" xmlns:w14="http://schemas.microsoft.com/office/word/2010/wordml" xmlns:w15="http://schemas.microsoft.com/office/word/2012/wordml" xmlns:w16cex="http://schemas.microsoft.com/office/word/2018/wordml/cex" xmlns:w16cid="http://schemas.microsoft.com/office/word/2016/wordml/cid" xmlns:w16="http://schemas.microsoft.com/office/word/2018/wordml" xmlns:w16sdtdh="http://schemas.microsoft.com/office/word/2020/wordml/sdtdatahash" xmlns:w16se="http://schemas.microsoft.com/office/word/2015/wordml/symex" xmlns:wpg="http://schemas.microsoft.com/office/word/2010/wordprocessingGroup" xmlns:wpi="http://schemas.microsoft.com/office/word/2010/wordprocessingInk" xmlns:wne="http://schemas.microsoft.com/office/word/2006/wordml" xmlns:wps="http://schemas.microsoft.com/office/word/2010/wordprocessingShape" mc:Ignorable="w14 w15 w16se w16cid w16 w16cex w16sdtdh wp14">
+  <w:endnote w:type="separator" w:id="-1">
+    <w:p>
+      <w:pPr>
+        <w:spacing w:line="240" w:lineRule="auto"/>
+      </w:pPr>
+      <w:r>
+        <w:separator/>
+      </w:r>
+    </w:p>
+  </w:endnote>
+  <w:endnote w:type="continuationSeparator" w:id="0">
+    <w:p>
+      <w:pPr>
+        <w:spacing w:line="240" w:lineRule="auto"/>
+      </w:pPr>
+      <w:r>
+        <w:continuationSeparator/>
+      </w:r>
+    </w:p>
+  </w:endnote>
+</w:endnotes>
+</file>
+
+<file path=word/footer1.xml><?xml version="1.0" encoding="utf-8"?>
+<w:ftr xmlns:wpc="http://schemas.microsoft.com/office/word/2010/wordprocessingCanvas" xmlns:cx="http://schemas.microsoft.com/office/drawing/2014/chartex" xmlns:cx1="http://schemas.microsoft.com/office/drawing/2015/9/8/chartex" xmlns:cx2="http://schemas.microsoft.com/office/drawing/2015/10/21/chartex" xmlns:cx3="http://schemas.microsoft.com/office/drawing/2016/5/9/chartex" xmlns:cx4="http://schemas.microsoft.com/office/drawing/2016/5/10/chartex" xmlns:cx5="http://schemas.microsoft.com/office/drawing/2016/5/11/chartex" xmlns:cx6="http://schemas.microsoft.com/office/drawing/2016/5/12/chartex" xmlns:cx7="http://schemas.microsoft.com/office/drawing/2016/5/13/chartex" xmlns:cx8="http://schemas.microsoft.com/office/drawing/2016/5/14/chartex" xmlns:mc="http://schemas.openxmlformats.org/markup-compatibility/2006" xmlns:aink="http://schemas.microsoft.com/office/drawing/2016/ink" xmlns:am3d="http://schemas.microsoft.com/office/drawing/2017/model3d" xmlns:o="urn:schemas-microsoft-com:office:office" xmlns:r="http://schemas.openxmlformats.org/officeDocument/2006/relationships" xmlns:m="http://schemas.openxmlformats.org/officeDocument/2006/math" xmlns:v="urn:schemas-microsoft-com:vml" xmlns:wp14="http://schemas.microsoft.com/office/word/2010/wordprocessingDrawing" xmlns:wp="http://schemas.openxmlformats.org/drawingml/2006/wordprocessingDrawing" xmlns:w10="urn:schemas-microsoft-com:office:word" xmlns:w="http://schemas.openxmlformats.org/wordprocessingml/2006/main" xmlns:w14="http://schemas.microsoft.com/office/word/2010/wordml" xmlns:w15="http://schemas.microsoft.com/office/word/2012/wordml" xmlns:w16cex="http://schemas.microsoft.com/office/word/2018/wordml/cex" xmlns:w16cid="http://schemas.microsoft.com/office/word/2016/wordml/cid" xmlns:w16="http://schemas.microsoft.com/office/word/2018/wordml" xmlns:w16sdtdh="http://schemas.microsoft.com/office/word/2020/wordml/sdtdatahash" xmlns:w16se="http://schemas.microsoft.com/office/word/2015/wordml/symex" xmlns:wpg="http://schemas.microsoft.com/office/word/2010/wordprocessingGroup" xmlns:wpi="http://schemas.microsoft.com/office/word/2010/wordprocessingInk" xmlns:wne="http://schemas.microsoft.com/office/word/2006/wordml" xmlns:wps="http://schemas.microsoft.com/office/word/2010/wordprocessingShape" mc:Ignorable="w14 w15 w16se w16cid w16 w16cex w16sdtdh wp14">
+  <w:sdt>
+    <w:sdtPr>
+      <w:id w:val="607326828"/>
+      <w:docPartObj>
+        <w:docPartGallery w:val="Page Numbers (Bottom of Page)"/>
+        <w:docPartUnique/>
+      </w:docPartObj>
+    </w:sdtPr>
+    <w:sdtEndPr/>
+    <w:sdtContent>
+      <w:p>
+        <w:pPr>
+          <w:pStyle w:val="a8"/>
+          <w:jc w:val="center"/>
+        </w:pPr>
+        <w:r>
+          <w:fldChar w:fldCharType="begin"/>
+        </w:r>
+        <w:r>
+          <w:instrText>PAGE   \* MERGEFORMAT</w:instrText>
+        </w:r>
+        <w:r>
+          <w:fldChar w:fldCharType="separate"/>
+        </w:r>
+        <w:r>
+          <w:t>2</w:t>
+        </w:r>
+        <w:r>
+          <w:fldChar w:fldCharType="end"/>
+        </w:r>
+      </w:p>
+    </w:sdtContent>
+  </w:sdt>
+  <w:p>
+    <w:pPr>
+      <w:pStyle w:val="a8"/>
+    </w:pPr>
+  </w:p>
+</w:ftr>
+</file>
+
+<file path=word/footnotes.xml><?xml version="1.0" encoding="utf-8"?>
+<w:footnotes xmlns:wpc="http://schemas.microsoft.com/office/word/2010/wordprocessingCanvas" xmlns:cx="http://schemas.microsoft.com/office/drawing/2014/chartex" xmlns:cx1="http://schemas.microsoft.com/office/drawing/2015/9/8/chartex" xmlns:cx2="http://schemas.microsoft.com/office/drawing/2015/10/21/chartex" xmlns:cx3="http://schemas.microsoft.com/office/drawing/2016/5/9/chartex" xmlns:cx4="http://schemas.microsoft.com/office/drawing/2016/5/10/chartex" xmlns:cx5="http://schemas.microsoft.com/office/drawing/2016/5/11/chartex" xmlns:cx6="http://schemas.microsoft.com/office/drawing/2016/5/12/chartex" xmlns:cx7="http://schemas.microsoft.com/office/drawing/2016/5/13/chartex" xmlns:cx8="http://schemas.microsoft.com/office/drawing/2016/5/14/chartex" xmlns:mc="http://schemas.openxmlformats.org/markup-compatibility/2006" xmlns:aink="http://schemas.microsoft.com/office/drawing/2016/ink" xmlns:am3d="http://schemas.microsoft.com/office/drawing/2017/model3d" xmlns:o="urn:schemas-microsoft-com:office:office" xmlns:r="http://schemas.openxmlformats.org/officeDocument/2006/relationships" xmlns:m="http://schemas.openxmlformats.org/officeDocument/2006/math" xmlns:v="urn:schemas-microsoft-com:vml" xmlns:wp14="http://schemas.microsoft.com/office/word/2010/wordprocessingDrawing" xmlns:wp="http://schemas.openxmlformats.org/drawingml/2006/wordprocessingDrawing" xmlns:w10="urn:schemas-microsoft-com:office:word" xmlns:w="http://schemas.openxmlformats.org/wordprocessingml/2006/main" xmlns:w14="http://schemas.microsoft.com/office/word/2010/wordml" xmlns:w15="http://schemas.microsoft.com/office/word/2012/wordml" xmlns:w16cex="http://schemas.microsoft.com/office/word/2018/wordml/cex" xmlns:w16cid="http://schemas.microsoft.com/office/word/2016/wordml/cid" xmlns:w16="http://schemas.microsoft.com/office/word/2018/wordml" xmlns:w16sdtdh="http://schemas.microsoft.com/office/word/2020/wordml/sdtdatahash" xmlns:w16se="http://schemas.microsoft.com/office/word/2015/wordml/symex" xmlns:wpg="http://schemas.microsoft.com/office/word/2010/wordprocessingGroup" xmlns:wpi="http://schemas.microsoft.com/office/word/2010/wordprocessingInk" xmlns:wne="http://schemas.microsoft.com/office/word/2006/wordml" xmlns:wps="http://schemas.microsoft.com/office/word/2010/wordprocessingShape" mc:Ignorable="w14 w15 w16se w16cid w16 w16cex w16sdtdh wp14">
+  <w:footnote w:type="separator" w:id="-1">
+    <w:p>
+      <w:pPr>
+        <w:spacing w:line="240" w:lineRule="auto"/>
+      </w:pPr>
+      <w:r>
+        <w:separator/>
+      </w:r>
+    </w:p>
+  </w:footnote>
+  <w:footnote w:type="continuationSeparator" w:id="0">
+    <w:p>
+      <w:pPr>
+        <w:spacing w:line="240" w:lineRule="auto"/>
+      </w:pPr>
+      <w:r>
+        <w:continuationSeparator/>
+      </w:r>
+    </w:p>
+  </w:footnote>
+</w:footnotes>
 </file>
 
 <file path=word/numbering.xml><?xml version="1.0" encoding="utf-8"?>
@@ -2216,6 +4316,127 @@
     <w:basedOn w:val="a"/>
     <w:qFormat/>
   </w:style>
+  <w:style w:type="paragraph" w:styleId="a5">
+    <w:name w:val="caption"/>
+    <w:basedOn w:val="a"/>
+    <w:next w:val="a"/>
+    <w:uiPriority w:val="35"/>
+    <w:unhideWhenUsed/>
+    <w:qFormat/>
+    <w:rsid w:val="00675CD0"/>
+    <w:pPr>
+      <w:spacing w:after="200" w:line="240" w:lineRule="auto"/>
+    </w:pPr>
+    <w:rPr>
+      <w:i/>
+      <w:iCs/>
+      <w:color w:val="44546A" w:themeColor="text2"/>
+      <w:sz w:val="18"/>
+      <w:szCs w:val="18"/>
+    </w:rPr>
+  </w:style>
+  <w:style w:type="paragraph" w:styleId="a6">
+    <w:name w:val="header"/>
+    <w:basedOn w:val="a"/>
+    <w:link w:val="a7"/>
+    <w:uiPriority w:val="99"/>
+    <w:unhideWhenUsed/>
+    <w:rsid w:val="007F6785"/>
+    <w:pPr>
+      <w:tabs>
+        <w:tab w:val="center" w:pos="4677"/>
+        <w:tab w:val="right" w:pos="9355"/>
+      </w:tabs>
+      <w:spacing w:line="240" w:lineRule="auto"/>
+    </w:pPr>
+  </w:style>
+  <w:style w:type="character" w:customStyle="1" w:styleId="a7">
+    <w:name w:val="Верхний колонтитул Знак"/>
+    <w:basedOn w:val="a0"/>
+    <w:link w:val="a6"/>
+    <w:uiPriority w:val="99"/>
+    <w:rsid w:val="007F6785"/>
+  </w:style>
+  <w:style w:type="paragraph" w:styleId="a8">
+    <w:name w:val="footer"/>
+    <w:basedOn w:val="a"/>
+    <w:link w:val="a9"/>
+    <w:uiPriority w:val="99"/>
+    <w:unhideWhenUsed/>
+    <w:rsid w:val="007F6785"/>
+    <w:pPr>
+      <w:tabs>
+        <w:tab w:val="center" w:pos="4677"/>
+        <w:tab w:val="right" w:pos="9355"/>
+      </w:tabs>
+      <w:spacing w:line="240" w:lineRule="auto"/>
+    </w:pPr>
+  </w:style>
+  <w:style w:type="character" w:customStyle="1" w:styleId="a9">
+    <w:name w:val="Нижний колонтитул Знак"/>
+    <w:basedOn w:val="a0"/>
+    <w:link w:val="a8"/>
+    <w:uiPriority w:val="99"/>
+    <w:rsid w:val="007F6785"/>
+  </w:style>
+  <w:style w:type="paragraph" w:styleId="aa">
+    <w:name w:val="TOC Heading"/>
+    <w:basedOn w:val="1"/>
+    <w:next w:val="a"/>
+    <w:uiPriority w:val="39"/>
+    <w:unhideWhenUsed/>
+    <w:qFormat/>
+    <w:rsid w:val="00490413"/>
+    <w:pPr>
+      <w:keepLines/>
+      <w:spacing w:before="240" w:line="259" w:lineRule="auto"/>
+      <w:outlineLvl w:val="9"/>
+    </w:pPr>
+    <w:rPr>
+      <w:rFonts w:asciiTheme="majorHAnsi" w:eastAsiaTheme="majorEastAsia" w:hAnsiTheme="majorHAnsi" w:cstheme="majorBidi"/>
+      <w:b w:val="0"/>
+      <w:bCs w:val="0"/>
+      <w:color w:val="2F5496" w:themeColor="accent1" w:themeShade="BF"/>
+      <w:sz w:val="32"/>
+      <w:szCs w:val="32"/>
+    </w:rPr>
+  </w:style>
+  <w:style w:type="paragraph" w:styleId="10">
+    <w:name w:val="toc 1"/>
+    <w:basedOn w:val="a"/>
+    <w:next w:val="a"/>
+    <w:autoRedefine/>
+    <w:uiPriority w:val="39"/>
+    <w:unhideWhenUsed/>
+    <w:rsid w:val="00490413"/>
+    <w:pPr>
+      <w:spacing w:after="100"/>
+    </w:pPr>
+  </w:style>
+  <w:style w:type="paragraph" w:styleId="20">
+    <w:name w:val="toc 2"/>
+    <w:basedOn w:val="a"/>
+    <w:next w:val="a"/>
+    <w:autoRedefine/>
+    <w:uiPriority w:val="39"/>
+    <w:unhideWhenUsed/>
+    <w:rsid w:val="00490413"/>
+    <w:pPr>
+      <w:spacing w:after="100"/>
+      <w:ind w:left="280"/>
+    </w:pPr>
+  </w:style>
+  <w:style w:type="character" w:styleId="ab">
+    <w:name w:val="Hyperlink"/>
+    <w:basedOn w:val="a0"/>
+    <w:uiPriority w:val="99"/>
+    <w:unhideWhenUsed/>
+    <w:rsid w:val="00490413"/>
+    <w:rPr>
+      <w:color w:val="0563C1" w:themeColor="hyperlink"/>
+      <w:u w:val="single"/>
+    </w:rPr>
+  </w:style>
 </w:styles>
 </file>
 
@@ -2512,4 +4733,16 @@
     </a:ext>
   </a:extLst>
 </a:theme>
+</file>
+
+<file path=customXml/item1.xml><?xml version="1.0" encoding="utf-8"?>
+<b:Sources xmlns:b="http://schemas.openxmlformats.org/officeDocument/2006/bibliography" xmlns="http://schemas.openxmlformats.org/officeDocument/2006/bibliography" SelectedStyle="\GostTitle.XSL" StyleName="ГОСТ — сортировка по названиям" Version="2003"/>
+</file>
+
+<file path=customXml/itemProps1.xml><?xml version="1.0" encoding="utf-8"?>
+<ds:datastoreItem xmlns:ds="http://schemas.openxmlformats.org/officeDocument/2006/customXml" ds:itemID="{F083BA65-D2EB-416D-AA77-1E70A7A8F8AE}">
+  <ds:schemaRefs>
+    <ds:schemaRef ds:uri="http://schemas.openxmlformats.org/officeDocument/2006/bibliography"/>
+  </ds:schemaRefs>
+</ds:datastoreItem>
 </file>
</xml_diff>